<commit_message>
Rapport cabinet : CSP du document, audit des sources sans virgule, nom du domaine N unifié, exports régénérés
Claude-Session: https://claude.ai/code/session_014aiVU2bF7ycrBWTupEsu67
</commit_message>
<xml_diff>
--- a/docs/design/rapport-cabinet/sortie/rapport-cabinet.docx
+++ b/docs/design/rapport-cabinet/sortie/rapport-cabinet.docx
@@ -34706,7 +34706,7 @@
         <w:pStyle w:val="BodyText"/>
       </w:pPr>
       <w:r>
-        <w:t xml:space="preserve">Domaine N (réactivité émotionnelle) : plutôt haut ou haut pour HT ; plutôt bas ou bas pour AM et KB.</w:t>
+        <w:t xml:space="preserve">Domaine N (névrosisme) : plutôt haut ou haut pour HT ; plutôt bas ou bas pour AM et KB.</w:t>
       </w:r>
     </w:p>
     <w:bookmarkEnd w:id="641"/>
@@ -36160,7 +36160,7 @@
         <w:pStyle w:val="Definition"/>
       </w:pPr>
       <w:r>
-        <w:t xml:space="preserve">Une seule personne en position plutôt haute ou haute : HT sur le domaine N (réactivité émotionnelle) et le domaine A (orientation vers autrui, agréabilité).</w:t>
+        <w:t xml:space="preserve">Une seule personne en position plutôt haute ou haute : HT sur le domaine N (névrosisme) et le domaine A (orientation vers autrui, agréabilité).</w:t>
       </w:r>
     </w:p>
     <w:p>
@@ -36900,7 +36900,7 @@
         <w:pStyle w:val="BodyText"/>
       </w:pPr>
       <w:r>
-        <w:t xml:space="preserve">Domaine N (réactivité émotionnelle) : la position d'ensemble de l'équipe se situe au milieu de l'échelle. Répartition des niveaux individuels : 2 au niveau plutôt bas, 1 au milieu de l'échelle et 1 au niveau plutôt haut.</w:t>
+        <w:t xml:space="preserve">Domaine N (névrosisme) : la position d'ensemble de l'équipe se situe au milieu de l'échelle. Répartition des niveaux individuels : 2 au niveau plutôt bas, 1 au milieu de l'échelle et 1 au niveau plutôt haut.</w:t>
       </w:r>
     </w:p>
     <w:bookmarkEnd w:id="701"/>

</xml_diff>

<commit_message>
Rapport cabinet : texte sur toute la largeur, tailles d'impression proportionnées, fiches de recommandation pleine largeur, radar et écarts du binôme sur une page, légende dégagée, « Conscienciosité »
Claude-Session: https://claude.ai/code/session_0173ZZiGgKQsBo3M4cbm5VpC
</commit_message>
<xml_diff>
--- a/docs/design/rapport-cabinet/sortie/rapport-cabinet.docx
+++ b/docs/design/rapport-cabinet/sortie/rapport-cabinet.docx
@@ -520,7 +520,7 @@
         <w:pStyle w:val="BodyText"/>
       </w:pPr>
       <w:r>
-        <w:t xml:space="preserve">Conscience (C) : valeur 100 sur l’échelle de 24 à 120, niveau haut. Les six facettes du domaine vont de 2 (C6) à 5 (C1, C3 et C4) sur l’échelle de 1 à 5 ; la dispersion est large au sens des conventions de l’outil (resserrée jusqu’à 0,5 point d’étendue, large à partir de 1 point).</w:t>
+        <w:t xml:space="preserve">Conscienciosité (C) : valeur 100 sur l’échelle de 24 à 120, niveau haut. Les six facettes du domaine vont de 2 (C6) à 5 (C1, C3 et C4) sur l’échelle de 1 à 5 ; la dispersion est large au sens des conventions de l’outil (resserrée jusqu’à 0,5 point d’étendue, large à partir de 1 point).</w:t>
       </w:r>
     </w:p>
     <w:bookmarkEnd w:id="22"/>
@@ -538,7 +538,7 @@
         <w:pStyle w:val="BodyText"/>
       </w:pPr>
       <w:r>
-        <w:t xml:space="preserve">Conscience : Les réponses se situent en haut de l’échelle de la personne sur cet axe. Lecture de convention, sans comparaison à un groupe, à confirmer en entretien.</w:t>
+        <w:t xml:space="preserve">Conscienciosité : Les réponses se situent en haut de l’échelle de la personne sur cet axe. Lecture de convention, sans comparaison à un groupe, à confirmer en entretien.</w:t>
       </w:r>
     </w:p>
     <w:p>
@@ -2301,7 +2301,7 @@
         <w:pStyle w:val="Heading3"/>
       </w:pPr>
       <w:r>
-        <w:t xml:space="preserve">Chapitre AM : facettes du domaine Conscience</w:t>
+        <w:t xml:space="preserve">Chapitre AM : facettes du domaine Conscienciosité</w:t>
       </w:r>
     </w:p>
     <w:bookmarkStart w:id="57" w:name="n1-AM-facettes-C-1"/>
@@ -2318,7 +2318,7 @@
         <w:pStyle w:val="BodyText"/>
       </w:pPr>
       <w:r>
-        <w:t xml:space="preserve">Facettes du domaine Conscience. Une valeur haute signifie davantage de ce que décrit le libellé de la facette. Les passages entre guillemets sont des textes de la bibliothèque, adressés à la personne.</w:t>
+        <w:t xml:space="preserve">Facettes du domaine Conscienciosité. Une valeur haute signifie davantage de ce que décrit le libellé de la facette. Les passages entre guillemets sont des textes de la bibliothèque, adressés à la personne.</w:t>
       </w:r>
     </w:p>
     <w:bookmarkEnd w:id="57"/>
@@ -3057,7 +3057,7 @@
         <w:pStyle w:val="BodyText"/>
       </w:pPr>
       <w:r>
-        <w:t xml:space="preserve">Domaine Conscience, règle TENS-C (écart d’au moins 1,5 point entre deux facettes du domaine) : C1-C6 (C1 « Confiance déclarée dans sa maîtrise des tâches » à 5 et C6 « Réflexion avant d’agir » à 2, écart de 3 points) ; C2-C6 (C2 « Organisation et rangement » à 4 et C6 « Réflexion avant d’agir » à 2, écart de 2 points) ; C3-C6 (C3 « Respect des engagements et des règles » à 5 et C6 « Réflexion avant d’agir » à 2, écart de 3 points) ; C4-C6 (C4 « Effort et engagement au travail » à 5 et C6 « Réflexion avant d’agir » à 2, écart de 3 points) ; C5-C6 (C5 « Autodiscipline » à 4 et C6 « Réflexion avant d’agir » à 2, écart de 2 points).</w:t>
+        <w:t xml:space="preserve">Domaine Conscienciosité, règle TENS-C (écart d’au moins 1,5 point entre deux facettes du domaine) : C1-C6 (C1 « Confiance déclarée dans sa maîtrise des tâches » à 5 et C6 « Réflexion avant d’agir » à 2, écart de 3 points) ; C2-C6 (C2 « Organisation et rangement » à 4 et C6 « Réflexion avant d’agir » à 2, écart de 2 points) ; C3-C6 (C3 « Respect des engagements et des règles » à 5 et C6 « Réflexion avant d’agir » à 2, écart de 3 points) ; C4-C6 (C4 « Effort et engagement au travail » à 5 et C6 « Réflexion avant d’agir » à 2, écart de 3 points) ; C5-C6 (C5 « Autodiscipline » à 4 et C6 « Réflexion avant d’agir » à 2, écart de 2 points).</w:t>
       </w:r>
     </w:p>
     <w:bookmarkEnd w:id="71"/>
@@ -3421,7 +3421,7 @@
         <w:pStyle w:val="BodyText"/>
       </w:pPr>
       <w:r>
-        <w:t xml:space="preserve">Conditions de la tâche à prendre en compte. Sur une tâche de projet à échéances, il se peut que le suivi des engagements et la circulation de l’information entre les personnes pèsent davantage que les préférences de style. À confirmer en entretien. Pour cette personne, les domaines pertinents sont : Conscience (C) au niveau haut ; Extraversion (E) au niveau haut. Une orientation de croissance demande d’aller vers de nouveaux interlocuteurs et de nouvelles façons de faire : il se peut que l’énergie relationnelle et l’ouverture des profils soient plus sollicitées. À confirmer en entretien. Pour cette personne, les domaines pertinents sont : Extraversion (E) au niveau haut ; Ouverture (O) au niveau haut.</w:t>
+        <w:t xml:space="preserve">Conditions de la tâche à prendre en compte. Sur une tâche de projet à échéances, il se peut que le suivi des engagements et la circulation de l’information entre les personnes pèsent davantage que les préférences de style. À confirmer en entretien. Pour cette personne, les domaines pertinents sont : Conscienciosité (C) au niveau haut ; Extraversion (E) au niveau haut. Une orientation de croissance demande d’aller vers de nouveaux interlocuteurs et de nouvelles façons de faire : il se peut que l’énergie relationnelle et l’ouverture des profils soient plus sollicitées. À confirmer en entretien. Pour cette personne, les domaines pertinents sont : Extraversion (E) au niveau haut ; Ouverture (O) au niveau haut.</w:t>
       </w:r>
     </w:p>
     <w:p>
@@ -3681,7 +3681,7 @@
         <w:pStyle w:val="BodyText"/>
       </w:pPr>
       <w:r>
-        <w:t xml:space="preserve">Conscience, niveau haut : des objectifs clairs, des délais connus et la maîtrise de son propre calendrier peuvent convenir ; des priorités changeantes ou des exigences de qualité floues peuvent peser.</w:t>
+        <w:t xml:space="preserve">Conscienciosité, niveau haut : des objectifs clairs, des délais connus et la maîtrise de son propre calendrier peuvent convenir ; des priorités changeantes ou des exigences de qualité floues peuvent peser.</w:t>
       </w:r>
     </w:p>
     <w:p>
@@ -3787,7 +3787,7 @@
         <w:pStyle w:val="BodyText"/>
       </w:pPr>
       <w:r>
-        <w:t xml:space="preserve">Priorité 1, domaine Conscience : tension C1-C6 relevée par la règle TENS-C, avec C1 « Confiance déclarée dans sa maîtrise des tâches » à 5 (haut) et C6 « Réflexion avant d’agir » à 2 (plutôt bas), soit 3 points d’écart. Hypothèse de travail : l’apport possible de « Confiance déclarée dans sa maîtrise des tâches » (« Votre confiance peut vous permettre d’entreprendre des tâches exigeantes et d’entraîner d’autres personnes. ») et le coût possible de « Réflexion avant d’agir » (« Il se peut que des détails vous échappent dans les décisions prises dans l’urgence. ») peuvent se rencontrer dans une même situation de travail ; à confirmer en entretien.</w:t>
+        <w:t xml:space="preserve">Priorité 1, domaine Conscienciosité : tension C1-C6 relevée par la règle TENS-C, avec C1 « Confiance déclarée dans sa maîtrise des tâches » à 5 (haut) et C6 « Réflexion avant d’agir » à 2 (plutôt bas), soit 3 points d’écart. Hypothèse de travail : l’apport possible de « Confiance déclarée dans sa maîtrise des tâches » (« Votre confiance peut vous permettre d’entreprendre des tâches exigeantes et d’entraîner d’autres personnes. ») et le coût possible de « Réflexion avant d’agir » (« Il se peut que des détails vous échappent dans les décisions prises dans l’urgence. ») peuvent se rencontrer dans une même situation de travail ; à confirmer en entretien.</w:t>
       </w:r>
     </w:p>
     <w:p>
@@ -4751,7 +4751,7 @@
         <w:pStyle w:val="BodyText"/>
       </w:pPr>
       <w:r>
-        <w:t xml:space="preserve">Conscience (C) : valeur 102 sur l’échelle de 24 à 120, niveau haut. Les six facettes du domaine vont de 4 (C5 et C6) à 4,5 (C2 et C3) sur l’échelle de 1 à 5 ; la dispersion est resserrée au sens des conventions de l’outil (resserrée jusqu’à 0,5 point d’étendue, large à partir de 1 point).</w:t>
+        <w:t xml:space="preserve">Conscienciosité (C) : valeur 102 sur l’échelle de 24 à 120, niveau haut. Les six facettes du domaine vont de 4 (C5 et C6) à 4,5 (C2 et C3) sur l’échelle de 1 à 5 ; la dispersion est resserrée au sens des conventions de l’outil (resserrée jusqu’à 0,5 point d’étendue, large à partir de 1 point).</w:t>
       </w:r>
     </w:p>
     <w:bookmarkEnd w:id="110"/>
@@ -4769,7 +4769,7 @@
         <w:pStyle w:val="BodyText"/>
       </w:pPr>
       <w:r>
-        <w:t xml:space="preserve">Conscience : Les réponses se situent en haut de l’échelle de la personne sur cet axe. Lecture de convention, sans comparaison à un groupe, à confirmer en entretien.</w:t>
+        <w:t xml:space="preserve">Conscienciosité : Les réponses se situent en haut de l’échelle de la personne sur cet axe. Lecture de convention, sans comparaison à un groupe, à confirmer en entretien.</w:t>
       </w:r>
     </w:p>
     <w:p>
@@ -6532,7 +6532,7 @@
         <w:pStyle w:val="Heading3"/>
       </w:pPr>
       <w:r>
-        <w:t xml:space="preserve">Chapitre KB : facettes du domaine Conscience</w:t>
+        <w:t xml:space="preserve">Chapitre KB : facettes du domaine Conscienciosité</w:t>
       </w:r>
     </w:p>
     <w:bookmarkStart w:id="145" w:name="n1-KB-facettes-C-1"/>
@@ -6549,7 +6549,7 @@
         <w:pStyle w:val="BodyText"/>
       </w:pPr>
       <w:r>
-        <w:t xml:space="preserve">Facettes du domaine Conscience. Une valeur haute signifie davantage de ce que décrit le libellé de la facette. Les passages entre guillemets sont des textes de la bibliothèque, adressés à la personne.</w:t>
+        <w:t xml:space="preserve">Facettes du domaine Conscienciosité. Une valeur haute signifie davantage de ce que décrit le libellé de la facette. Les passages entre guillemets sont des textes de la bibliothèque, adressés à la personne.</w:t>
       </w:r>
     </w:p>
     <w:bookmarkEnd w:id="145"/>
@@ -7231,7 +7231,7 @@
         <w:pStyle w:val="BodyText"/>
       </w:pPr>
       <w:r>
-        <w:t xml:space="preserve">Conditions de la tâche à prendre en compte. Sur une tâche de projet à échéances, il se peut que le suivi des engagements et la circulation de l’information entre les personnes pèsent davantage que les préférences de style. À confirmer en entretien. Pour cette personne, les domaines pertinents sont : Conscience (C) au niveau haut ; Extraversion (E) au niveau milieu de l’échelle. Une orientation de croissance demande d’aller vers de nouveaux interlocuteurs et de nouvelles façons de faire : il se peut que l’énergie relationnelle et l’ouverture des profils soient plus sollicitées. À confirmer en entretien. Pour cette personne, les domaines pertinents sont : Extraversion (E) au niveau milieu de l’échelle ; Ouverture (O) au niveau plutôt bas.</w:t>
+        <w:t xml:space="preserve">Conditions de la tâche à prendre en compte. Sur une tâche de projet à échéances, il se peut que le suivi des engagements et la circulation de l’information entre les personnes pèsent davantage que les préférences de style. À confirmer en entretien. Pour cette personne, les domaines pertinents sont : Conscienciosité (C) au niveau haut ; Extraversion (E) au niveau milieu de l’échelle. Une orientation de croissance demande d’aller vers de nouveaux interlocuteurs et de nouvelles façons de faire : il se peut que l’énergie relationnelle et l’ouverture des profils soient plus sollicitées. À confirmer en entretien. Pour cette personne, les domaines pertinents sont : Extraversion (E) au niveau milieu de l’échelle ; Ouverture (O) au niveau plutôt bas.</w:t>
       </w:r>
     </w:p>
     <w:p>
@@ -7491,7 +7491,7 @@
         <w:pStyle w:val="BodyText"/>
       </w:pPr>
       <w:r>
-        <w:t xml:space="preserve">Conscience, niveau haut : des objectifs clairs, des délais connus et la maîtrise de son propre calendrier peuvent convenir ; des priorités changeantes ou des exigences de qualité floues peuvent peser.</w:t>
+        <w:t xml:space="preserve">Conscienciosité, niveau haut : des objectifs clairs, des délais connus et la maîtrise de son propre calendrier peuvent convenir ; des priorités changeantes ou des exigences de qualité floues peuvent peser.</w:t>
       </w:r>
     </w:p>
     <w:p>
@@ -7955,7 +7955,7 @@
         <w:pStyle w:val="BodyText"/>
       </w:pPr>
       <w:r>
-        <w:t xml:space="preserve">Conscience (C) : valeur 70 sur l’échelle de 24 à 120, niveau milieu de l’échelle. Les six facettes du domaine vont de 2,25 (C6) à 3,5 (C4) sur l’échelle de 1 à 5 ; la dispersion est large au sens des conventions de l’outil (resserrée jusqu’à 0,5 point d’étendue, large à partir de 1 point).</w:t>
+        <w:t xml:space="preserve">Conscienciosité (C) : valeur 70 sur l’échelle de 24 à 120, niveau milieu de l’échelle. Les six facettes du domaine vont de 2,25 (C6) à 3,5 (C4) sur l’échelle de 1 à 5 ; la dispersion est large au sens des conventions de l’outil (resserrée jusqu’à 0,5 point d’étendue, large à partir de 1 point).</w:t>
       </w:r>
     </w:p>
     <w:bookmarkEnd w:id="182"/>
@@ -7973,7 +7973,7 @@
         <w:pStyle w:val="BodyText"/>
       </w:pPr>
       <w:r>
-        <w:t xml:space="preserve">Conscience : Les réponses sont proches du milieu de l’échelle sur cet axe. Cela ne dit pas que la personne est équilibrée ou indécise : lecture de convention, à confirmer en entretien.</w:t>
+        <w:t xml:space="preserve">Conscienciosité : Les réponses sont proches du milieu de l’échelle sur cet axe. Cela ne dit pas que la personne est équilibrée ou indécise : lecture de convention, à confirmer en entretien.</w:t>
       </w:r>
     </w:p>
     <w:p>
@@ -9736,7 +9736,7 @@
         <w:pStyle w:val="Heading3"/>
       </w:pPr>
       <w:r>
-        <w:t xml:space="preserve">Chapitre SR : facettes du domaine Conscience</w:t>
+        <w:t xml:space="preserve">Chapitre SR : facettes du domaine Conscienciosité</w:t>
       </w:r>
     </w:p>
     <w:bookmarkStart w:id="217" w:name="n1-SR-facettes-C-1"/>
@@ -9753,7 +9753,7 @@
         <w:pStyle w:val="BodyText"/>
       </w:pPr>
       <w:r>
-        <w:t xml:space="preserve">Facettes du domaine Conscience. Une valeur haute signifie davantage de ce que décrit le libellé de la facette. Les passages entre guillemets sont des textes de la bibliothèque, adressés à la personne.</w:t>
+        <w:t xml:space="preserve">Facettes du domaine Conscienciosité. Une valeur haute signifie davantage de ce que décrit le libellé de la facette. Les passages entre guillemets sont des textes de la bibliothèque, adressés à la personne.</w:t>
       </w:r>
     </w:p>
     <w:bookmarkEnd w:id="217"/>
@@ -10435,7 +10435,7 @@
         <w:pStyle w:val="BodyText"/>
       </w:pPr>
       <w:r>
-        <w:t xml:space="preserve">Conditions de la tâche à prendre en compte. Sur une tâche de projet à échéances, il se peut que le suivi des engagements et la circulation de l’information entre les personnes pèsent davantage que les préférences de style. À confirmer en entretien. Pour cette personne, les domaines pertinents sont : Conscience (C) au niveau milieu de l’échelle ; Extraversion (E) au niveau haut. Une orientation de croissance demande d’aller vers de nouveaux interlocuteurs et de nouvelles façons de faire : il se peut que l’énergie relationnelle et l’ouverture des profils soient plus sollicitées. À confirmer en entretien. Pour cette personne, les domaines pertinents sont : Extraversion (E) au niveau haut ; Ouverture (O) au niveau haut.</w:t>
+        <w:t xml:space="preserve">Conditions de la tâche à prendre en compte. Sur une tâche de projet à échéances, il se peut que le suivi des engagements et la circulation de l’information entre les personnes pèsent davantage que les préférences de style. À confirmer en entretien. Pour cette personne, les domaines pertinents sont : Conscienciosité (C) au niveau milieu de l’échelle ; Extraversion (E) au niveau haut. Une orientation de croissance demande d’aller vers de nouveaux interlocuteurs et de nouvelles façons de faire : il se peut que l’énergie relationnelle et l’ouverture des profils soient plus sollicitées. À confirmer en entretien. Pour cette personne, les domaines pertinents sont : Extraversion (E) au niveau haut ; Ouverture (O) au niveau haut.</w:t>
       </w:r>
     </w:p>
     <w:p>
@@ -10695,7 +10695,7 @@
         <w:pStyle w:val="BodyText"/>
       </w:pPr>
       <w:r>
-        <w:t xml:space="preserve">Conscience, niveau milieu de l’échelle : un cadre qui fixe l’essentiel et laisse de la marge sur le reste peut convenir ; l’entretien précisera les tâches où davantage de structure est souhaitée.</w:t>
+        <w:t xml:space="preserve">Conscienciosité, niveau milieu de l’échelle : un cadre qui fixe l’essentiel et laisse de la marge sur le reste peut convenir ; l’entretien précisera les tâches où davantage de structure est souhaitée.</w:t>
       </w:r>
     </w:p>
     <w:p>
@@ -11159,7 +11159,7 @@
         <w:pStyle w:val="BodyText"/>
       </w:pPr>
       <w:r>
-        <w:t xml:space="preserve">Conscience (C) : valeur 93 sur l’échelle de 24 à 120, niveau plutôt haut. Les six facettes du domaine vont de 3,5 (C6) à 4,25 (C2) sur l’échelle de 1 à 5 ; la dispersion est intermédiaire au sens des conventions de l’outil (resserrée jusqu’à 0,5 point d’étendue, large à partir de 1 point).</w:t>
+        <w:t xml:space="preserve">Conscienciosité (C) : valeur 93 sur l’échelle de 24 à 120, niveau plutôt haut. Les six facettes du domaine vont de 3,5 (C6) à 4,25 (C2) sur l’échelle de 1 à 5 ; la dispersion est intermédiaire au sens des conventions de l’outil (resserrée jusqu’à 0,5 point d’étendue, large à partir de 1 point).</w:t>
       </w:r>
     </w:p>
     <w:bookmarkEnd w:id="254"/>
@@ -11177,7 +11177,7 @@
         <w:pStyle w:val="BodyText"/>
       </w:pPr>
       <w:r>
-        <w:t xml:space="preserve">Conscience : Les réponses se situent plutôt vers le haut de l’échelle de la personne sur cet axe. Lecture de convention, sans comparaison à un groupe, à confirmer en entretien.</w:t>
+        <w:t xml:space="preserve">Conscienciosité : Les réponses se situent plutôt vers le haut de l’échelle de la personne sur cet axe. Lecture de convention, sans comparaison à un groupe, à confirmer en entretien.</w:t>
       </w:r>
     </w:p>
     <w:p>
@@ -12940,7 +12940,7 @@
         <w:pStyle w:val="Heading3"/>
       </w:pPr>
       <w:r>
-        <w:t xml:space="preserve">Chapitre HT : facettes du domaine Conscience</w:t>
+        <w:t xml:space="preserve">Chapitre HT : facettes du domaine Conscienciosité</w:t>
       </w:r>
     </w:p>
     <w:bookmarkStart w:id="289" w:name="n1-HT-facettes-C-1"/>
@@ -12957,7 +12957,7 @@
         <w:pStyle w:val="BodyText"/>
       </w:pPr>
       <w:r>
-        <w:t xml:space="preserve">Facettes du domaine Conscience. Une valeur haute signifie davantage de ce que décrit le libellé de la facette. Les passages entre guillemets sont des textes de la bibliothèque, adressés à la personne.</w:t>
+        <w:t xml:space="preserve">Facettes du domaine Conscienciosité. Une valeur haute signifie davantage de ce que décrit le libellé de la facette. Les passages entre guillemets sont des textes de la bibliothèque, adressés à la personne.</w:t>
       </w:r>
     </w:p>
     <w:bookmarkEnd w:id="289"/>
@@ -13639,7 +13639,7 @@
         <w:pStyle w:val="BodyText"/>
       </w:pPr>
       <w:r>
-        <w:t xml:space="preserve">Conditions de la tâche à prendre en compte. Sur une tâche de projet à échéances, il se peut que le suivi des engagements et la circulation de l’information entre les personnes pèsent davantage que les préférences de style. À confirmer en entretien. Pour cette personne, les domaines pertinents sont : Conscience (C) au niveau plutôt haut ; Extraversion (E) au niveau plutôt bas. Une orientation de croissance demande d’aller vers de nouveaux interlocuteurs et de nouvelles façons de faire : il se peut que l’énergie relationnelle et l’ouverture des profils soient plus sollicitées. À confirmer en entretien. Pour cette personne, les domaines pertinents sont : Extraversion (E) au niveau plutôt bas ; Ouverture (O) au niveau plutôt haut.</w:t>
+        <w:t xml:space="preserve">Conditions de la tâche à prendre en compte. Sur une tâche de projet à échéances, il se peut que le suivi des engagements et la circulation de l’information entre les personnes pèsent davantage que les préférences de style. À confirmer en entretien. Pour cette personne, les domaines pertinents sont : Conscienciosité (C) au niveau plutôt haut ; Extraversion (E) au niveau plutôt bas. Une orientation de croissance demande d’aller vers de nouveaux interlocuteurs et de nouvelles façons de faire : il se peut que l’énergie relationnelle et l’ouverture des profils soient plus sollicitées. À confirmer en entretien. Pour cette personne, les domaines pertinents sont : Extraversion (E) au niveau plutôt bas ; Ouverture (O) au niveau plutôt haut.</w:t>
       </w:r>
     </w:p>
     <w:p>
@@ -13899,7 +13899,7 @@
         <w:pStyle w:val="BodyText"/>
       </w:pPr>
       <w:r>
-        <w:t xml:space="preserve">Conscience, niveau plutôt haut : des objectifs clairs, des délais connus et la maîtrise de son propre calendrier peuvent convenir ; des priorités changeantes ou des exigences de qualité floues peuvent peser.</w:t>
+        <w:t xml:space="preserve">Conscienciosité, niveau plutôt haut : des objectifs clairs, des délais connus et la maîtrise de son propre calendrier peuvent convenir ; des priorités changeantes ou des exigences de qualité floues peuvent peser.</w:t>
       </w:r>
     </w:p>
     <w:p>
@@ -14001,13 +14001,13 @@
         <w:t xml:space="preserve">Recommandations</w:t>
       </w:r>
     </w:p>
-    <w:bookmarkStart w:id="314" w:name="Xc3f3f40dc9c58c11ebfcb34eae5f1e9cbd15627"/>
+    <w:bookmarkStart w:id="314" w:name="Xe7bc5fed48a3028bb69c67446a147ca8a7024fb"/>
     <w:p>
       <w:pPr>
         <w:pStyle w:val="Heading4"/>
       </w:pPr>
       <w:r>
-        <w:t xml:space="preserve">Conduire la priorité 1 du plan de développement (domaine Conscience) sur 90 jours : explorer la tension C1-C6 avec un consultant qualifié, convenir d’une façon de limiter le coût possible de « Réflexion avant d’agir », puis faire le point.</w:t>
+        <w:t xml:space="preserve">Conduire la priorité 1 du plan de développement (domaine Conscienciosité) sur 90 jours : explorer la tension C1-C6 avec un consultant qualifié, convenir d’une façon de limiter le coût possible de « Réflexion avant d’agir », puis faire le point.</w:t>
       </w:r>
     </w:p>
     <w:p>
@@ -35200,7 +35200,7 @@
         <w:pStyle w:val="BodyText"/>
       </w:pPr>
       <w:r>
-        <w:t xml:space="preserve">Adéquation organisationnelle (effectif de 4 personnes pour un seuil d’anonymat de 5 : agrégat montré par dérogation de démonstration) : valeurs d’équipe pour Extraversion à 3,48 (plutôt haut), Ouverture à 3,64 (plutôt haut) et Conscience à 3,8 (plutôt haut), selon les conventions de l’outil. Ces valeurs se lisent avec la structure (bureaucratie mécaniste), la culture dominante (hiérarchie) et l’orientation de croissance ; leur effet sur le travail de l’équipe est à instruire en entretien, et les dispositifs d’organisation du plan en tiennent compte.</w:t>
+        <w:t xml:space="preserve">Adéquation organisationnelle (effectif de 4 personnes pour un seuil d’anonymat de 5 : agrégat montré par dérogation de démonstration) : valeurs d’équipe pour Extraversion à 3,48 (plutôt haut), Ouverture à 3,64 (plutôt haut) et Conscienciosité à 3,8 (plutôt haut), selon les conventions de l’outil. Ces valeurs se lisent avec la structure (bureaucratie mécaniste), la culture dominante (hiérarchie) et l’orientation de croissance ; leur effet sur le travail de l’équipe est à instruire en entretien, et les dispositifs d’organisation du plan en tiennent compte.</w:t>
       </w:r>
     </w:p>
     <w:bookmarkEnd w:id="746"/>

</xml_diff>

<commit_message>
Rapport cabinet : écarts arrondis à deux décimales, l'audit accepte les arrondis d'un fait (décision d'Amine)
Claude-Session: https://claude.ai/code/session_0173ZZiGgKQsBo3M4cbm5VpC
</commit_message>
<xml_diff>
--- a/docs/design/rapport-cabinet/sortie/rapport-cabinet.docx
+++ b/docs/design/rapport-cabinet/sortie/rapport-cabinet.docx
@@ -15093,7 +15093,7 @@
         <w:pStyle w:val="BodyText"/>
       </w:pPr>
       <w:r>
-        <w:t xml:space="preserve">Écarts entre AM et KB, repris des faits calculés : domaine N (sensibilité à la tension) : écart 0,4583, proche ; AM plutôt bas, KB plutôt bas ; domaine E (énergie relationnelle) : écart 0,8333, intermédiaire ; AM haut, KB milieu de l’échelle ; domaine O (ouverture aux idées nouvelles) : écart 1,5417, notable ; AM haut, KB plutôt bas ; domaine A (façon de coopérer et de traiter un désaccord) : écart 0,2917, proche ; AM milieu de l’échelle, KB milieu de l’échelle ; domaine C (organisation et suivi des engagements) : écart 0,0833, proche ; AM haut, KB haut. Facettes notables les plus éloignées, retenues pour la tâche : O5 (écart 3 ; AM haut, KB plutôt bas) ; C6 (écart 2 ; AM plutôt bas, KB haut) ; O4 (écart 1,75 ; AM haut, KB plutôt bas). Le domaine N et les facettes à lecture sensible ne sont lus qu’au niveau du domaine. Langues de passation : AM (français), KB (français) ; équivalence des versions non établie.</w:t>
+        <w:t xml:space="preserve">Écarts entre AM et KB, repris des faits calculés : domaine N (sensibilité à la tension) : écart 0,46, proche ; AM plutôt bas, KB plutôt bas ; domaine E (énergie relationnelle) : écart 0,83, intermédiaire ; AM haut, KB milieu de l’échelle ; domaine O (ouverture aux idées nouvelles) : écart 1,54, notable ; AM haut, KB plutôt bas ; domaine A (façon de coopérer et de traiter un désaccord) : écart 0,29, proche ; AM milieu de l’échelle, KB milieu de l’échelle ; domaine C (organisation et suivi des engagements) : écart 0,08, proche ; AM haut, KB haut. Facettes notables les plus éloignées, retenues pour la tâche : O5 (écart 3 ; AM haut, KB plutôt bas) ; C6 (écart 2 ; AM plutôt bas, KB haut) ; O4 (écart 1,75 ; AM haut, KB plutôt bas). Le domaine N et les facettes à lecture sensible ne sont lus qu’au niveau du domaine. Langues de passation : AM (français), KB (français) ; équivalence des versions non établie.</w:t>
       </w:r>
     </w:p>
     <w:bookmarkEnd w:id="334"/>
@@ -15329,7 +15329,7 @@
         <w:pStyle w:val="BodyText"/>
       </w:pPr>
       <w:r>
-        <w:t xml:space="preserve">Les réponses d’AM et de KB sont voisines sur le domaine N (écart 0,4583), le domaine A (écart 0,2917) et le domaine C (écart 0,0833). Il se peut que ce point de rencontre facilite la compréhension mutuelle : pour le domaine N, une façon voisine de réagir à l’incertitude et à la pression, qui peut faciliter le partage des inquiétudes sur le calendrier ; pour le domaine A, une manière voisine de coopérer et de traiter un désaccord, qui peut faciliter une franchise ou une prudence partagée ; pour le domaine C, un rapport voisin à l’organisation et au suivi des engagements, qui peut faciliter l’accord sur les points d’étape. Dans une ligne hiérarchique, ces points de rencontre peuvent aider à poser des attentes claires sans longue négociation (règles ECART-proche, CAL-NAT-ligne).</w:t>
+        <w:t xml:space="preserve">Les réponses d’AM et de KB sont voisines sur le domaine N (écart 0,46), le domaine A (écart 0,29) et le domaine C (écart 0,08). Il se peut que ce point de rencontre facilite la compréhension mutuelle : pour le domaine N, une façon voisine de réagir à l’incertitude et à la pression, qui peut faciliter le partage des inquiétudes sur le calendrier ; pour le domaine A, une manière voisine de coopérer et de traiter un désaccord, qui peut faciliter une franchise ou une prudence partagée ; pour le domaine C, un rapport voisin à l’organisation et au suivi des engagements, qui peut faciliter l’accord sur les points d’étape. Dans une ligne hiérarchique, ces points de rencontre peuvent aider à poser des attentes claires sans longue négociation (règles ECART-proche, CAL-NAT-ligne).</w:t>
       </w:r>
     </w:p>
     <w:p>
@@ -15379,7 +15379,7 @@
         <w:pStyle w:val="BodyText"/>
       </w:pPr>
       <w:r>
-        <w:t xml:space="preserve">Sur le domaine O (ouverture aux idées nouvelles) : écart 1,5417, notable ; AM haut, KB plutôt bas. Il se peut que cette différence d’ouverture serve la tâche : AM peut apporter des pistes nouvelles pendant que KB les met à l’épreuve de l’existant, de sorte qu’exploration et sécurisation du lancement soient couvertes. Dans une ligne hiérarchique, cette complémentarité ne joue que si la personne qui oriente laisse une place explicite à l’autre manière de faire (règles ECART-notable, CAL-NAT-ligne).</w:t>
+        <w:t xml:space="preserve">Sur le domaine O (ouverture aux idées nouvelles) : écart 1,54, notable ; AM haut, KB plutôt bas. Il se peut que cette différence d’ouverture serve la tâche : AM peut apporter des pistes nouvelles pendant que KB les met à l’épreuve de l’existant, de sorte qu’exploration et sécurisation du lancement soient couvertes. Dans une ligne hiérarchique, cette complémentarité ne joue que si la personne qui oriente laisse une place explicite à l’autre manière de faire (règles ECART-notable, CAL-NAT-ligne).</w:t>
       </w:r>
     </w:p>
     <w:p>
@@ -15739,7 +15739,7 @@
         <w:pStyle w:val="BodyText"/>
       </w:pPr>
       <w:r>
-        <w:t xml:space="preserve">Sur le domaine O (ouverture aux idées nouvelles) : écart 1,5417, notable ; AM haut, KB plutôt bas. Il se peut qu’AM propose des façons de faire nouvelles que KB lit comme une remise en cause des méthodes en place, et que KB attende un cadre précis avant d’explorer (règles ECART-notable, CAL-NAT-ligne).</w:t>
+        <w:t xml:space="preserve">Sur le domaine O (ouverture aux idées nouvelles) : écart 1,54, notable ; AM haut, KB plutôt bas. Il se peut qu’AM propose des façons de faire nouvelles que KB lit comme une remise en cause des méthodes en place, et que KB attende un cadre précis avant d’explorer (règles ECART-notable, CAL-NAT-ligne).</w:t>
       </w:r>
     </w:p>
     <w:p>
@@ -17049,7 +17049,7 @@
         <w:pStyle w:val="BodyText"/>
       </w:pPr>
       <w:r>
-        <w:t xml:space="preserve">Écarts entre AM et SR, repris des faits calculés : domaine N (sensibilité à la tension) : écart 0,6667, intermédiaire ; AM plutôt bas, SR milieu de l’échelle ; domaine E (énergie relationnelle) : écart 0,0417, proche ; AM haut, SR haut ; domaine O (ouverture aux idées nouvelles) : écart 0,375, proche ; AM haut, SR haut ; domaine A (façon de coopérer et de traiter un désaccord) : écart 0,0417, proche ; AM milieu de l’échelle, SR milieu de l’échelle ; domaine C (organisation et suivi des engagements) : écart 1,25, notable ; AM haut, SR milieu de l’échelle. Facettes notables les plus éloignées, retenues pour la tâche : C1 (écart 2 ; AM haut, SR milieu de l’échelle) ; C3 (écart 1,75 ; AM haut, SR milieu de l’échelle) ; E3 (écart 1,5 ; AM haut, SR plutôt haut). Le domaine N et les facettes à lecture sensible ne sont lus qu’au niveau du domaine. Langues de passation : AM (français), SR (arabe) ; équivalence des versions non établie.</w:t>
+        <w:t xml:space="preserve">Écarts entre AM et SR, repris des faits calculés : domaine N (sensibilité à la tension) : écart 0,67, intermédiaire ; AM plutôt bas, SR milieu de l’échelle ; domaine E (énergie relationnelle) : écart 0,04, proche ; AM haut, SR haut ; domaine O (ouverture aux idées nouvelles) : écart 0,38, proche ; AM haut, SR haut ; domaine A (façon de coopérer et de traiter un désaccord) : écart 0,04, proche ; AM milieu de l’échelle, SR milieu de l’échelle ; domaine C (organisation et suivi des engagements) : écart 1,25, notable ; AM haut, SR milieu de l’échelle. Facettes notables les plus éloignées, retenues pour la tâche : C1 (écart 2 ; AM haut, SR milieu de l’échelle) ; C3 (écart 1,75 ; AM haut, SR milieu de l’échelle) ; E3 (écart 1,5 ; AM haut, SR plutôt haut). Le domaine N et les facettes à lecture sensible ne sont lus qu’au niveau du domaine. Langues de passation : AM (français), SR (arabe) ; équivalence des versions non établie.</w:t>
       </w:r>
     </w:p>
     <w:bookmarkEnd w:id="376"/>
@@ -17317,7 +17317,7 @@
         <w:pStyle w:val="BodyText"/>
       </w:pPr>
       <w:r>
-        <w:t xml:space="preserve">Les réponses d’AM et de SR sont voisines sur le domaine E (écart 0,0417), le domaine O (écart 0,375) et le domaine A (écart 0,0417). Il se peut que ce point de rencontre facilite la compréhension mutuelle : pour le domaine E, un niveau voisin d’énergie relationnelle, qui peut faciliter un rythme d’échange accepté par les deux ; pour le domaine O, une ouverture voisine aux idées nouvelles, qui peut faciliter l’accord sur le degré de changement souhaitable ; pour le domaine A, une manière voisine de coopérer et de traiter un désaccord, qui peut faciliter une franchise ou une prudence partagée. Dans un lien fonctionnel, ils peuvent aider les deux fonctions à se comprendre sans autorité commune (règles ECART-proche, CAL-NAT-fonctionnel).</w:t>
+        <w:t xml:space="preserve">Les réponses d’AM et de SR sont voisines sur le domaine E (écart 0,04), le domaine O (écart 0,38) et le domaine A (écart 0,04). Il se peut que ce point de rencontre facilite la compréhension mutuelle : pour le domaine E, un niveau voisin d’énergie relationnelle, qui peut faciliter un rythme d’échange accepté par les deux ; pour le domaine O, une ouverture voisine aux idées nouvelles, qui peut faciliter l’accord sur le degré de changement souhaitable ; pour le domaine A, une manière voisine de coopérer et de traiter un désaccord, qui peut faciliter une franchise ou une prudence partagée. Dans un lien fonctionnel, ils peuvent aider les deux fonctions à se comprendre sans autorité commune (règles ECART-proche, CAL-NAT-fonctionnel).</w:t>
       </w:r>
     </w:p>
     <w:p>
@@ -19087,7 +19087,7 @@
         <w:pStyle w:val="BodyText"/>
       </w:pPr>
       <w:r>
-        <w:t xml:space="preserve">Écarts entre AM et HT, repris des faits calculés : domaine N (sensibilité à la tension) : écart 1,1667, notable ; AM plutôt bas, HT plutôt haut ; domaine E (énergie relationnelle) : écart 1,875, notable ; AM haut, HT plutôt bas ; domaine O (ouverture aux idées nouvelles) : écart 0,2917, proche ; AM haut, HT plutôt haut ; domaine A (façon de coopérer et de traiter un désaccord) : écart 1,2917, notable ; AM milieu de l’échelle, HT haut ; domaine C (organisation et suivi des engagements) : écart 0,2917, proche ; AM haut, HT plutôt haut. Facettes notables les plus éloignées, retenues pour la tâche : E3 (écart 3 ; AM haut, HT plutôt bas) ; A4 (écart 2,5 ; AM plutôt bas, HT haut) ; E4 (écart 2,25 ; AM haut, HT milieu de l’échelle). Le domaine N et les facettes à lecture sensible ne sont lus qu’au niveau du domaine. Langues de passation : AM (français), HT (français) ; équivalence des versions non établie.</w:t>
+        <w:t xml:space="preserve">Écarts entre AM et HT, repris des faits calculés : domaine N (sensibilité à la tension) : écart 1,17, notable ; AM plutôt bas, HT plutôt haut ; domaine E (énergie relationnelle) : écart 1,88, notable ; AM haut, HT plutôt bas ; domaine O (ouverture aux idées nouvelles) : écart 0,29, proche ; AM haut, HT plutôt haut ; domaine A (façon de coopérer et de traiter un désaccord) : écart 1,29, notable ; AM milieu de l’échelle, HT haut ; domaine C (organisation et suivi des engagements) : écart 0,29, proche ; AM haut, HT plutôt haut. Facettes notables les plus éloignées, retenues pour la tâche : E3 (écart 3 ; AM haut, HT plutôt bas) ; A4 (écart 2,5 ; AM plutôt bas, HT haut) ; E4 (écart 2,25 ; AM haut, HT milieu de l’échelle). Le domaine N et les facettes à lecture sensible ne sont lus qu’au niveau du domaine. Langues de passation : AM (français), HT (français) ; équivalence des versions non établie.</w:t>
       </w:r>
     </w:p>
     <w:bookmarkEnd w:id="419"/>
@@ -19305,7 +19305,7 @@
         <w:pStyle w:val="BodyText"/>
       </w:pPr>
       <w:r>
-        <w:t xml:space="preserve">Les réponses d’AM et de HT sont voisines sur le domaine O (écart 0,2917) et le domaine C (écart 0,2917). Il se peut que ce point de rencontre facilite la compréhension mutuelle : pour le domaine O, une ouverture voisine aux idées nouvelles, qui peut faciliter l’accord sur le degré de changement souhaitable ; pour le domaine C, un rapport voisin à l’organisation et au suivi des engagements, qui peut faciliter l’accord sur les points d’étape. En mentorat, ils peuvent donner un terrain d’entente pour les premiers échanges (règles ECART-proche, CAL-NAT-mentorat).</w:t>
+        <w:t xml:space="preserve">Les réponses d’AM et de HT sont voisines sur le domaine O (écart 0,29) et le domaine C (écart 0,29). Il se peut que ce point de rencontre facilite la compréhension mutuelle : pour le domaine O, une ouverture voisine aux idées nouvelles, qui peut faciliter l’accord sur le degré de changement souhaitable ; pour le domaine C, un rapport voisin à l’organisation et au suivi des engagements, qui peut faciliter l’accord sur les points d’étape. En mentorat, ils peuvent donner un terrain d’entente pour les premiers échanges (règles ECART-proche, CAL-NAT-mentorat).</w:t>
       </w:r>
     </w:p>
     <w:p>
@@ -19355,7 +19355,7 @@
         <w:pStyle w:val="BodyText"/>
       </w:pPr>
       <w:r>
-        <w:t xml:space="preserve">Sur le domaine E (énergie relationnelle) : écart 1,875, notable ; AM haut, HT plutôt bas. Il se peut que cette différence d’énergie relationnelle serve la tâche : AM peut porter la relation vers l’extérieur (siège, équipes) pendant que HT consolide le travail en profondeur. En mentorat, elle prend la forme d’un échange de perspectives : la personne mentorée peut y trouver une autre façon de faire sans devoir l’adopter (règles ECART-notable, CAL-NAT-mentorat).</w:t>
+        <w:t xml:space="preserve">Sur le domaine E (énergie relationnelle) : écart 1,88, notable ; AM haut, HT plutôt bas. Il se peut que cette différence d’énergie relationnelle serve la tâche : AM peut porter la relation vers l’extérieur (siège, équipes) pendant que HT consolide le travail en profondeur. En mentorat, elle prend la forme d’un échange de perspectives : la personne mentorée peut y trouver une autre façon de faire sans devoir l’adopter (règles ECART-notable, CAL-NAT-mentorat).</w:t>
       </w:r>
     </w:p>
     <w:p>
@@ -19405,7 +19405,7 @@
         <w:pStyle w:val="BodyText"/>
       </w:pPr>
       <w:r>
-        <w:t xml:space="preserve">Sur le domaine A (façon de coopérer et de traiter un désaccord) : écart 1,2917, notable ; AM milieu de l’échelle, HT haut. Il se peut que cette différence de façon de coopérer serve la tâche : HT peut entretenir la qualité de l’échange pendant qu’AM dit plus directement ce qui ne va pas. En mentorat, elle prend la forme d’un échange de perspectives : la personne mentorée peut y trouver une autre façon de faire sans devoir l’adopter (règles ECART-notable, CAL-NAT-mentorat).</w:t>
+        <w:t xml:space="preserve">Sur le domaine A (façon de coopérer et de traiter un désaccord) : écart 1,29, notable ; AM milieu de l’échelle, HT haut. Il se peut que cette différence de façon de coopérer serve la tâche : HT peut entretenir la qualité de l’échange pendant qu’AM dit plus directement ce qui ne va pas. En mentorat, elle prend la forme d’un échange de perspectives : la personne mentorée peut y trouver une autre façon de faire sans devoir l’adopter (règles ECART-notable, CAL-NAT-mentorat).</w:t>
       </w:r>
     </w:p>
     <w:p>
@@ -19765,7 +19765,7 @@
         <w:pStyle w:val="BodyText"/>
       </w:pPr>
       <w:r>
-        <w:t xml:space="preserve">Sur le domaine E (énergie relationnelle) : écart 1,875, notable ; AM haut, HT plutôt bas. Il se peut que le temps de parole soit très inégal et que l’échange de mentorat prenne la forme d’un monologue d’AM plutôt que d’un dialogue où HT s’exprime (règles ECART-notable, CAL-NAT-mentorat).</w:t>
+        <w:t xml:space="preserve">Sur le domaine E (énergie relationnelle) : écart 1,88, notable ; AM haut, HT plutôt bas. Il se peut que le temps de parole soit très inégal et que l’échange de mentorat prenne la forme d’un monologue d’AM plutôt que d’un dialogue où HT s’exprime (règles ECART-notable, CAL-NAT-mentorat).</w:t>
       </w:r>
     </w:p>
     <w:p>
@@ -19815,7 +19815,7 @@
         <w:pStyle w:val="BodyText"/>
       </w:pPr>
       <w:r>
-        <w:t xml:space="preserve">Sur le domaine A (façon de coopérer et de traiter un désaccord) : écart 1,2917, notable ; AM milieu de l’échelle, HT haut. Il se peut que HT approuve les conseils reçus sans oser dire qu’ils ne conviennent pas, et qu’AM en conclue qu’ils sont utiles (règles ECART-notable, CAL-NAT-mentorat).</w:t>
+        <w:t xml:space="preserve">Sur le domaine A (façon de coopérer et de traiter un désaccord) : écart 1,29, notable ; AM milieu de l’échelle, HT haut. Il se peut que HT approuve les conseils reçus sans oser dire qu’ils ne conviennent pas, et qu’AM en conclue qu’ils sont utiles (règles ECART-notable, CAL-NAT-mentorat).</w:t>
       </w:r>
     </w:p>
     <w:p>
@@ -21107,7 +21107,7 @@
         <w:pStyle w:val="BodyText"/>
       </w:pPr>
       <w:r>
-        <w:t xml:space="preserve">Écarts entre KB et SR, repris des faits calculés : domaine N (sensibilité à la tension) : écart 1,125, notable ; KB plutôt bas, SR milieu de l’échelle ; domaine E (énergie relationnelle) : écart 0,7917, intermédiaire ; KB milieu de l’échelle, SR haut ; domaine O (ouverture aux idées nouvelles) : écart 1,9167, notable ; KB plutôt bas, SR haut ; domaine A (façon de coopérer et de traiter un désaccord) : écart 0,3333, proche ; KB milieu de l’échelle, SR milieu de l’échelle ; domaine C (organisation et suivi des engagements) : écart 1,3333, notable ; KB haut, SR milieu de l’échelle. Facettes notables les plus éloignées, retenues pour la tâche : O4 (écart 2,5 ; KB plutôt bas, SR haut) ; O5 (écart 2 ; KB plutôt bas, SR haut) ; C2 (écart 1,75 ; KB haut, SR milieu de l’échelle). Le domaine N et les facettes à lecture sensible ne sont lus qu’au niveau du domaine. Langues de passation : KB (français), SR (arabe) ; équivalence des versions non établie.</w:t>
+        <w:t xml:space="preserve">Écarts entre KB et SR, repris des faits calculés : domaine N (sensibilité à la tension) : écart 1,13, notable ; KB plutôt bas, SR milieu de l’échelle ; domaine E (énergie relationnelle) : écart 0,79, intermédiaire ; KB milieu de l’échelle, SR haut ; domaine O (ouverture aux idées nouvelles) : écart 1,92, notable ; KB plutôt bas, SR haut ; domaine A (façon de coopérer et de traiter un désaccord) : écart 0,33, proche ; KB milieu de l’échelle, SR milieu de l’échelle ; domaine C (organisation et suivi des engagements) : écart 1,33, notable ; KB haut, SR milieu de l’échelle. Facettes notables les plus éloignées, retenues pour la tâche : O4 (écart 2,5 ; KB plutôt bas, SR haut) ; O5 (écart 2 ; KB plutôt bas, SR haut) ; C2 (écart 1,75 ; KB haut, SR milieu de l’échelle). Le domaine N et les facettes à lecture sensible ne sont lus qu’au niveau du domaine. Langues de passation : KB (français), SR (arabe) ; équivalence des versions non établie.</w:t>
       </w:r>
     </w:p>
     <w:bookmarkEnd w:id="461"/>
@@ -21375,7 +21375,7 @@
         <w:pStyle w:val="BodyText"/>
       </w:pPr>
       <w:r>
-        <w:t xml:space="preserve">Les réponses de KB et de SR sont voisines sur le domaine A (écart 0,3333). Il se peut que ce point de rencontre facilite la compréhension mutuelle : pour le domaine A, une manière voisine de coopérer et de traiter un désaccord, qui peut faciliter une franchise ou une prudence partagée. Entre client et fournisseur internes, ils peuvent réduire les malentendus sur la demande (règles ECART-proche, CAL-NAT-client-fournisseur).</w:t>
+        <w:t xml:space="preserve">Les réponses de KB et de SR sont voisines sur le domaine A (écart 0,33). Il se peut que ce point de rencontre facilite la compréhension mutuelle : pour le domaine A, une manière voisine de coopérer et de traiter un désaccord, qui peut faciliter une franchise ou une prudence partagée. Entre client et fournisseur internes, ils peuvent réduire les malentendus sur la demande (règles ECART-proche, CAL-NAT-client-fournisseur).</w:t>
       </w:r>
     </w:p>
     <w:p>
@@ -21425,7 +21425,7 @@
         <w:pStyle w:val="BodyText"/>
       </w:pPr>
       <w:r>
-        <w:t xml:space="preserve">Sur le domaine O (ouverture aux idées nouvelles) : écart 1,9167, notable ; KB plutôt bas, SR haut. Il se peut que cette différence d’ouverture serve la tâche : SR peut apporter des pistes nouvelles pendant que KB les met à l’épreuve de l’existant, de sorte qu’exploration et sécurisation du lancement soient couvertes. Entre client et fournisseur internes, elle joue si la demande et la réponse sont formulées de façon à laisser voir ce que chaque fonction apporte (règles ECART-notable, CAL-NAT-client-fournisseur).</w:t>
+        <w:t xml:space="preserve">Sur le domaine O (ouverture aux idées nouvelles) : écart 1,92, notable ; KB plutôt bas, SR haut. Il se peut que cette différence d’ouverture serve la tâche : SR peut apporter des pistes nouvelles pendant que KB les met à l’épreuve de l’existant, de sorte qu’exploration et sécurisation du lancement soient couvertes. Entre client et fournisseur internes, elle joue si la demande et la réponse sont formulées de façon à laisser voir ce que chaque fonction apporte (règles ECART-notable, CAL-NAT-client-fournisseur).</w:t>
       </w:r>
     </w:p>
     <w:p>
@@ -21475,7 +21475,7 @@
         <w:pStyle w:val="BodyText"/>
       </w:pPr>
       <w:r>
-        <w:t xml:space="preserve">Sur le domaine C (organisation et suivi des engagements) : écart 1,3333, notable ; KB haut, SR milieu de l’échelle. Il se peut que cette différence d’organisation serve la tâche : KB peut tenir le cadre, les dates et le suivi pendant que SR garde de la souplesse face aux imprévus du lancement. Entre client et fournisseur internes, elle joue si la demande et la réponse sont formulées de façon à laisser voir ce que chaque fonction apporte (règles ECART-notable, CAL-NAT-client-fournisseur).</w:t>
+        <w:t xml:space="preserve">Sur le domaine C (organisation et suivi des engagements) : écart 1,33, notable ; KB haut, SR milieu de l’échelle. Il se peut que cette différence d’organisation serve la tâche : KB peut tenir le cadre, les dates et le suivi pendant que SR garde de la souplesse face aux imprévus du lancement. Entre client et fournisseur internes, elle joue si la demande et la réponse sont formulées de façon à laisser voir ce que chaque fonction apporte (règles ECART-notable, CAL-NAT-client-fournisseur).</w:t>
       </w:r>
     </w:p>
     <w:p>
@@ -21835,7 +21835,7 @@
         <w:pStyle w:val="BodyText"/>
       </w:pPr>
       <w:r>
-        <w:t xml:space="preserve">Sur le domaine O (ouverture aux idées nouvelles) : écart 1,9167, notable ; KB plutôt bas, SR haut. Il se peut que SR attende que le livrable intègre des idées nouvelles quand KB s’en tient à la spécification reçue, ce qui crée des reprises tardives (règles ECART-notable, CAL-NAT-client-fournisseur).</w:t>
+        <w:t xml:space="preserve">Sur le domaine O (ouverture aux idées nouvelles) : écart 1,92, notable ; KB plutôt bas, SR haut. Il se peut que SR attende que le livrable intègre des idées nouvelles quand KB s’en tient à la spécification reçue, ce qui crée des reprises tardives (règles ECART-notable, CAL-NAT-client-fournisseur).</w:t>
       </w:r>
     </w:p>
     <w:p>
@@ -21885,7 +21885,7 @@
         <w:pStyle w:val="BodyText"/>
       </w:pPr>
       <w:r>
-        <w:t xml:space="preserve">Sur le domaine C (organisation et suivi des engagements) : écart 1,3333, notable ; KB haut, SR milieu de l’échelle. Il se peut que KB soit exigeant sur le détail et le respect des échéances et que SR livre selon des critères moins formalisés : les reprises se concentrent alors près des échéances (règles ECART-notable, CAL-NAT-client-fournisseur).</w:t>
+        <w:t xml:space="preserve">Sur le domaine C (organisation et suivi des engagements) : écart 1,33, notable ; KB haut, SR milieu de l’échelle. Il se peut que KB soit exigeant sur le détail et le respect des échéances et que SR livre selon des critères moins formalisés : les reprises se concentrent alors près des échéances (règles ECART-notable, CAL-NAT-client-fournisseur).</w:t>
       </w:r>
     </w:p>
     <w:p>
@@ -23277,7 +23277,7 @@
         <w:pStyle w:val="BodyText"/>
       </w:pPr>
       <w:r>
-        <w:t xml:space="preserve">Écarts entre KB et HT, repris des faits calculés : domaine N (sensibilité à la tension) : écart 1,625, notable ; KB plutôt bas, HT plutôt haut ; domaine E (énergie relationnelle) : écart 1,0417, notable ; KB milieu de l’échelle, HT plutôt bas ; domaine O (ouverture aux idées nouvelles) : écart 1,25, notable ; KB plutôt bas, HT plutôt haut ; domaine A (façon de coopérer et de traiter un désaccord) : écart 1, notable ; KB milieu de l’échelle, HT haut ; domaine C (organisation et suivi des engagements) : écart 0,375, proche ; KB haut, HT plutôt haut. Facettes notables les plus éloignées, retenues pour la tâche : E3 (écart 1,75 ; KB plutôt haut, HT plutôt bas) ; O5 (écart 1,75 ; KB plutôt bas, HT plutôt haut) ; O4 (écart 1,25 ; KB plutôt bas, HT plutôt haut). Le domaine N et les facettes à lecture sensible ne sont lus qu’au niveau du domaine. Langues de passation : KB (français), HT (français) ; équivalence des versions non établie.</w:t>
+        <w:t xml:space="preserve">Écarts entre KB et HT, repris des faits calculés : domaine N (sensibilité à la tension) : écart 1,63, notable ; KB plutôt bas, HT plutôt haut ; domaine E (énergie relationnelle) : écart 1,04, notable ; KB milieu de l’échelle, HT plutôt bas ; domaine O (ouverture aux idées nouvelles) : écart 1,25, notable ; KB plutôt bas, HT plutôt haut ; domaine A (façon de coopérer et de traiter un désaccord) : écart 1, notable ; KB milieu de l’échelle, HT haut ; domaine C (organisation et suivi des engagements) : écart 0,38, proche ; KB haut, HT plutôt haut. Facettes notables les plus éloignées, retenues pour la tâche : E3 (écart 1,75 ; KB plutôt haut, HT plutôt bas) ; O5 (écart 1,75 ; KB plutôt bas, HT plutôt haut) ; O4 (écart 1,25 ; KB plutôt bas, HT plutôt haut). Le domaine N et les facettes à lecture sensible ne sont lus qu’au niveau du domaine. Langues de passation : KB (français), HT (français) ; équivalence des versions non établie.</w:t>
       </w:r>
     </w:p>
     <w:bookmarkEnd w:id="506"/>
@@ -23495,7 +23495,7 @@
         <w:pStyle w:val="BodyText"/>
       </w:pPr>
       <w:r>
-        <w:t xml:space="preserve">Les réponses de KB et de HT sont voisines sur le domaine C (écart 0,375). Il se peut que ce point de rencontre facilite la compréhension mutuelle : pour le domaine C, un rapport voisin à l’organisation et au suivi des engagements, qui peut faciliter l’accord sur les points d’étape. Entre pairs, ils peuvent faciliter la décision commune en l’absence d’arbitre (règles ECART-proche, CAL-NAT-pairs).</w:t>
+        <w:t xml:space="preserve">Les réponses de KB et de HT sont voisines sur le domaine C (écart 0,38). Il se peut que ce point de rencontre facilite la compréhension mutuelle : pour le domaine C, un rapport voisin à l’organisation et au suivi des engagements, qui peut faciliter l’accord sur les points d’étape. Entre pairs, ils peuvent faciliter la décision commune en l’absence d’arbitre (règles ECART-proche, CAL-NAT-pairs).</w:t>
       </w:r>
     </w:p>
     <w:p>
@@ -23545,7 +23545,7 @@
         <w:pStyle w:val="BodyText"/>
       </w:pPr>
       <w:r>
-        <w:t xml:space="preserve">Sur le domaine N (sensibilité à la tension) : écart 1,625, notable ; KB plutôt bas, HT plutôt haut. Il se peut que cette différence de sensibilité à la tension devienne une ressource pour la tâche : HT repère plus tôt les risques à instruire pendant que KB garde le cap quand l’incertitude monte. Entre pairs, elle joue si aucune des deux manières de faire n’est présentée comme la référence (règles ECART-notable, CAL-NAT-pairs).</w:t>
+        <w:t xml:space="preserve">Sur le domaine N (sensibilité à la tension) : écart 1,63, notable ; KB plutôt bas, HT plutôt haut. Il se peut que cette différence de sensibilité à la tension devienne une ressource pour la tâche : HT repère plus tôt les risques à instruire pendant que KB garde le cap quand l’incertitude monte. Entre pairs, elle joue si aucune des deux manières de faire n’est présentée comme la référence (règles ECART-notable, CAL-NAT-pairs).</w:t>
       </w:r>
     </w:p>
     <w:p>
@@ -23955,7 +23955,7 @@
         <w:pStyle w:val="BodyText"/>
       </w:pPr>
       <w:r>
-        <w:t xml:space="preserve">Sur le domaine N (sensibilité à la tension) : écart 1,625, notable ; KB plutôt bas, HT plutôt haut. Il se peut que HT veuille lever une incertitude tout de suite quand KB juge pouvoir attendre, et que, sans arbitre entre elles, ce désaccord sur le bon moment de décider reste sans issue (règles ECART-notable, CAL-NAT-pairs).</w:t>
+        <w:t xml:space="preserve">Sur le domaine N (sensibilité à la tension) : écart 1,63, notable ; KB plutôt bas, HT plutôt haut. Il se peut que HT veuille lever une incertitude tout de suite quand KB juge pouvoir attendre, et que, sans arbitre entre elles, ce désaccord sur le bon moment de décider reste sans issue (règles ECART-notable, CAL-NAT-pairs).</w:t>
       </w:r>
     </w:p>
     <w:p>
@@ -25297,7 +25297,7 @@
         <w:pStyle w:val="BodyText"/>
       </w:pPr>
       <w:r>
-        <w:t xml:space="preserve">Écarts entre SR et HT, repris des faits calculés : domaine N (sensibilité à la tension) : écart 0,5, proche ; SR milieu de l’échelle, HT plutôt haut ; domaine E (énergie relationnelle) : écart 1,8333, notable ; SR haut, HT plutôt bas ; domaine O (ouverture aux idées nouvelles) : écart 0,6667, intermédiaire ; SR haut, HT plutôt haut ; domaine A (façon de coopérer et de traiter un désaccord) : écart 1,3333, notable ; SR milieu de l’échelle, HT haut ; domaine C (organisation et suivi des engagements) : écart 0,9583, intermédiaire ; SR milieu de l’échelle, HT plutôt haut. Facettes notables les plus éloignées, retenues pour la tâche : E1 (écart 1,75 ; SR haut, HT plutôt bas) ; E3 (écart 1,5 ; SR plutôt haut, HT plutôt bas) ; A4 (écart 1,5 ; SR milieu de l’échelle, HT haut). Le domaine N et les facettes à lecture sensible ne sont lus qu’au niveau du domaine. Langues de passation : SR (arabe), HT (français) ; équivalence des versions non établie.</w:t>
+        <w:t xml:space="preserve">Écarts entre SR et HT, repris des faits calculés : domaine N (sensibilité à la tension) : écart 0,5, proche ; SR milieu de l’échelle, HT plutôt haut ; domaine E (énergie relationnelle) : écart 1,83, notable ; SR haut, HT plutôt bas ; domaine O (ouverture aux idées nouvelles) : écart 0,67, intermédiaire ; SR haut, HT plutôt haut ; domaine A (façon de coopérer et de traiter un désaccord) : écart 1,33, notable ; SR milieu de l’échelle, HT haut ; domaine C (organisation et suivi des engagements) : écart 0,96, intermédiaire ; SR milieu de l’échelle, HT plutôt haut. Facettes notables les plus éloignées, retenues pour la tâche : E1 (écart 1,75 ; SR haut, HT plutôt bas) ; E3 (écart 1,5 ; SR plutôt haut, HT plutôt bas) ; A4 (écart 1,5 ; SR milieu de l’échelle, HT haut). Le domaine N et les facettes à lecture sensible ne sont lus qu’au niveau du domaine. Langues de passation : SR (arabe), HT (français) ; équivalence des versions non établie.</w:t>
       </w:r>
     </w:p>
     <w:bookmarkEnd w:id="548"/>
@@ -25615,7 +25615,7 @@
         <w:pStyle w:val="BodyText"/>
       </w:pPr>
       <w:r>
-        <w:t xml:space="preserve">Sur le domaine E (énergie relationnelle) : écart 1,8333, notable ; SR haut, HT plutôt bas. Il se peut que cette différence d’énergie relationnelle serve la tâche : SR peut porter la relation vers l’extérieur (siège, équipes) pendant que HT consolide le travail en profondeur. En co-direction, elle joue si chacune des deux personnes reconnaît devant l’équipe l’apport de l’autre (règles ECART-notable, CAL-NAT-co-direction).</w:t>
+        <w:t xml:space="preserve">Sur le domaine E (énergie relationnelle) : écart 1,83, notable ; SR haut, HT plutôt bas. Il se peut que cette différence d’énergie relationnelle serve la tâche : SR peut porter la relation vers l’extérieur (siège, équipes) pendant que HT consolide le travail en profondeur. En co-direction, elle joue si chacune des deux personnes reconnaît devant l’équipe l’apport de l’autre (règles ECART-notable, CAL-NAT-co-direction).</w:t>
       </w:r>
     </w:p>
     <w:p>
@@ -25665,7 +25665,7 @@
         <w:pStyle w:val="BodyText"/>
       </w:pPr>
       <w:r>
-        <w:t xml:space="preserve">Sur le domaine A (façon de coopérer et de traiter un désaccord) : écart 1,3333, notable ; SR milieu de l’échelle, HT haut. Il se peut que cette différence de façon de coopérer serve la tâche : HT peut entretenir la qualité de l’échange pendant que SR dit plus directement ce qui ne va pas. En co-direction, elle joue si chacune des deux personnes reconnaît devant l’équipe l’apport de l’autre (règles ECART-notable, CAL-NAT-co-direction).</w:t>
+        <w:t xml:space="preserve">Sur le domaine A (façon de coopérer et de traiter un désaccord) : écart 1,33, notable ; SR milieu de l’échelle, HT haut. Il se peut que cette différence de façon de coopérer serve la tâche : HT peut entretenir la qualité de l’échange pendant que SR dit plus directement ce qui ne va pas. En co-direction, elle joue si chacune des deux personnes reconnaît devant l’équipe l’apport de l’autre (règles ECART-notable, CAL-NAT-co-direction).</w:t>
       </w:r>
     </w:p>
     <w:p>
@@ -26025,7 +26025,7 @@
         <w:pStyle w:val="BodyText"/>
       </w:pPr>
       <w:r>
-        <w:t xml:space="preserve">Sur le domaine E (énergie relationnelle) : écart 1,8333, notable ; SR haut, HT plutôt bas. Il se peut que, devant l’équipe ou le siège, la voix de SR domine et donne l’impression d’une position unique, alors que HT partage la responsabilité du résultat (règles ECART-notable, CAL-NAT-co-direction).</w:t>
+        <w:t xml:space="preserve">Sur le domaine E (énergie relationnelle) : écart 1,83, notable ; SR haut, HT plutôt bas. Il se peut que, devant l’équipe ou le siège, la voix de SR domine et donne l’impression d’une position unique, alors que HT partage la responsabilité du résultat (règles ECART-notable, CAL-NAT-co-direction).</w:t>
       </w:r>
     </w:p>
     <w:p>
@@ -26075,7 +26075,7 @@
         <w:pStyle w:val="BodyText"/>
       </w:pPr>
       <w:r>
-        <w:t xml:space="preserve">Sur le domaine A (façon de coopérer et de traiter un désaccord) : écart 1,3333, notable ; SR milieu de l’échelle, HT haut. Il se peut que HT cède pour garder l’entente et que SR tranche plus nettement ; sans règle explicite pour trancher à deux, les décisions risquent de refléter un seul point de vue (règles ECART-notable, CAL-NAT-co-direction).</w:t>
+        <w:t xml:space="preserve">Sur le domaine A (façon de coopérer et de traiter un désaccord) : écart 1,33, notable ; SR milieu de l’échelle, HT haut. Il se peut que HT cède pour garder l’entente et que SR tranche plus nettement ; sans règle explicite pour trancher à deux, les décisions risquent de refléter un seul point de vue (règles ECART-notable, CAL-NAT-co-direction).</w:t>
       </w:r>
     </w:p>
     <w:p>
@@ -27417,7 +27417,7 @@
         <w:pStyle w:val="Definition"/>
       </w:pPr>
       <w:r>
-        <w:t xml:space="preserve">Écart de 1,5417 sur le domaine O, notable ; AM haut, KB plutôt bas (AM-KB).</w:t>
+        <w:t xml:space="preserve">Écart de 1,54 sur le domaine O, notable ; AM haut, KB plutôt bas (AM-KB).</w:t>
       </w:r>
     </w:p>
     <w:p>
@@ -27539,7 +27539,7 @@
         <w:pStyle w:val="Definition"/>
       </w:pPr>
       <w:r>
-        <w:t xml:space="preserve">Écart de 1,5417 sur le domaine O, notable ; AM haut, KB plutôt bas (AM-KB).</w:t>
+        <w:t xml:space="preserve">Écart de 1,54 sur le domaine O, notable ; AM haut, KB plutôt bas (AM-KB).</w:t>
       </w:r>
     </w:p>
     <w:p>
@@ -27661,7 +27661,7 @@
         <w:pStyle w:val="Definition"/>
       </w:pPr>
       <w:r>
-        <w:t xml:space="preserve">Écart de 0,8333 sur le domaine E, intermédiaire ; AM haut, KB milieu de l’échelle (AM-KB).</w:t>
+        <w:t xml:space="preserve">Écart de 0,83 sur le domaine E, intermédiaire ; AM haut, KB milieu de l’échelle (AM-KB).</w:t>
       </w:r>
     </w:p>
     <w:p>
@@ -28166,7 +28166,7 @@
         <w:pStyle w:val="Definition"/>
       </w:pPr>
       <w:r>
-        <w:t xml:space="preserve">Écart de 0,6667 sur le domaine N, intermédiaire ; AM plutôt bas, SR milieu de l’échelle (AM-SR).</w:t>
+        <w:t xml:space="preserve">Écart de 0,67 sur le domaine N, intermédiaire ; AM plutôt bas, SR milieu de l’échelle (AM-SR).</w:t>
       </w:r>
     </w:p>
     <w:p>
@@ -28549,7 +28549,7 @@
         <w:pStyle w:val="Definition"/>
       </w:pPr>
       <w:r>
-        <w:t xml:space="preserve">Écart de 1,875 sur le domaine E, notable ; AM haut, HT plutôt bas (AM-HT).</w:t>
+        <w:t xml:space="preserve">Écart de 1,88 sur le domaine E, notable ; AM haut, HT plutôt bas (AM-HT).</w:t>
       </w:r>
     </w:p>
     <w:p>
@@ -28671,7 +28671,7 @@
         <w:pStyle w:val="Definition"/>
       </w:pPr>
       <w:r>
-        <w:t xml:space="preserve">Écart de 1,875 sur le domaine E, notable ; AM haut, HT plutôt bas (AM-HT).</w:t>
+        <w:t xml:space="preserve">Écart de 1,88 sur le domaine E, notable ; AM haut, HT plutôt bas (AM-HT).</w:t>
       </w:r>
     </w:p>
     <w:p>
@@ -28793,7 +28793,7 @@
         <w:pStyle w:val="Definition"/>
       </w:pPr>
       <w:r>
-        <w:t xml:space="preserve">Écart de 1,2917 sur le domaine A, notable ; AM milieu de l’échelle, HT haut (AM-HT).</w:t>
+        <w:t xml:space="preserve">Écart de 1,29 sur le domaine A, notable ; AM milieu de l’échelle, HT haut (AM-HT).</w:t>
       </w:r>
     </w:p>
     <w:p>
@@ -29054,7 +29054,7 @@
         <w:pStyle w:val="Definition"/>
       </w:pPr>
       <w:r>
-        <w:t xml:space="preserve">Écart de 1,9167 sur le domaine O, notable ; KB plutôt bas, SR haut (KB-SR).</w:t>
+        <w:t xml:space="preserve">Écart de 1,92 sur le domaine O, notable ; KB plutôt bas, SR haut (KB-SR).</w:t>
       </w:r>
     </w:p>
     <w:p>
@@ -29176,7 +29176,7 @@
         <w:pStyle w:val="Definition"/>
       </w:pPr>
       <w:r>
-        <w:t xml:space="preserve">Écart de 1,9167 sur le domaine O, notable ; KB plutôt bas, SR haut (KB-SR).</w:t>
+        <w:t xml:space="preserve">Écart de 1,92 sur le domaine O, notable ; KB plutôt bas, SR haut (KB-SR).</w:t>
       </w:r>
     </w:p>
     <w:p>
@@ -29298,7 +29298,7 @@
         <w:pStyle w:val="Definition"/>
       </w:pPr>
       <w:r>
-        <w:t xml:space="preserve">Écart de 1,3333 sur le domaine C, notable ; KB haut, SR milieu de l’échelle (KB-SR).</w:t>
+        <w:t xml:space="preserve">Écart de 1,33 sur le domaine C, notable ; KB haut, SR milieu de l’échelle (KB-SR).</w:t>
       </w:r>
     </w:p>
     <w:p>
@@ -29681,7 +29681,7 @@
         <w:pStyle w:val="Definition"/>
       </w:pPr>
       <w:r>
-        <w:t xml:space="preserve">Écart de 1,625 sur le domaine N, notable ; KB plutôt bas, HT plutôt haut (KB-HT).</w:t>
+        <w:t xml:space="preserve">Écart de 1,63 sur le domaine N, notable ; KB plutôt bas, HT plutôt haut (KB-HT).</w:t>
       </w:r>
     </w:p>
     <w:p>
@@ -29803,7 +29803,7 @@
         <w:pStyle w:val="Definition"/>
       </w:pPr>
       <w:r>
-        <w:t xml:space="preserve">Écart de 1,625 sur le domaine N, notable ; KB plutôt bas, HT plutôt haut (KB-HT).</w:t>
+        <w:t xml:space="preserve">Écart de 1,63 sur le domaine N, notable ; KB plutôt bas, HT plutôt haut (KB-HT).</w:t>
       </w:r>
     </w:p>
     <w:p>
@@ -30186,7 +30186,7 @@
         <w:pStyle w:val="Definition"/>
       </w:pPr>
       <w:r>
-        <w:t xml:space="preserve">Écart de 1,8333 sur le domaine E, notable ; SR haut, HT plutôt bas (SR-HT).</w:t>
+        <w:t xml:space="preserve">Écart de 1,83 sur le domaine E, notable ; SR haut, HT plutôt bas (SR-HT).</w:t>
       </w:r>
     </w:p>
     <w:p>
@@ -30308,7 +30308,7 @@
         <w:pStyle w:val="Definition"/>
       </w:pPr>
       <w:r>
-        <w:t xml:space="preserve">Écart de 1,8333 sur le domaine E, notable ; SR haut, HT plutôt bas (SR-HT).</w:t>
+        <w:t xml:space="preserve">Écart de 1,83 sur le domaine E, notable ; SR haut, HT plutôt bas (SR-HT).</w:t>
       </w:r>
     </w:p>
     <w:p>
@@ -30430,7 +30430,7 @@
         <w:pStyle w:val="Definition"/>
       </w:pPr>
       <w:r>
-        <w:t xml:space="preserve">Écart de 1,3333 sur le domaine A, notable ; SR milieu de l’échelle, HT haut (SR-HT).</w:t>
+        <w:t xml:space="preserve">Écart de 1,33 sur le domaine A, notable ; SR milieu de l’échelle, HT haut (SR-HT).</w:t>
       </w:r>
     </w:p>
     <w:p>

</xml_diff>

<commit_message>
Rapport cabinet : libellés de facettes jamais tronqués, « conscienciosité » partout
- Carte de chaleur et écarts par facette : la colonne des libellés s'élargit au plus long
  (mesuré en Segoe UI) ; plus de libellé coupé sous les cases de score ni barré par la
  graduation 1. Largeur des écarts inchangée (texte toujours à 7,5 pt à l'impression),
  cases de la carte de chaleur de 66 à 52 (texte à 9,4 pt).
- Règle TENS-C et libellés de domaine du niveau équipe : « conscienciosité » au lieu de
  « conscience » ; profils-fictifs/generer.mjs aligné.
- Faits, rapport et exports régénérés : 0 chevauchement de texte sur les 177 pages du PDF.

Claude-Session: https://claude.ai/code/session_0173ZZiGgKQsBo3M4cbm5VpC
</commit_message>
<xml_diff>
--- a/docs/design/rapport-cabinet/sortie/rapport-cabinet.docx
+++ b/docs/design/rapport-cabinet/sortie/rapport-cabinet.docx
@@ -32,7 +32,7 @@
         <w:pStyle w:val="BodyText"/>
       </w:pPr>
       <w:r>
-        <w:t xml:space="preserve">Version du rapport rapport-cabinet-1.0 · empreinte des entrées 3dfdf6225f1196568e81bcbbd3adeb291e939fb4e2b96878f28eada9070a8458</w:t>
+        <w:t xml:space="preserve">Version du rapport rapport-cabinet-1.0 · empreinte des entrées f735212733a9da211a5404493fa2de8ef5caa851797047dbec508cdb26cecf4d</w:t>
       </w:r>
     </w:p>
     <w:bookmarkStart w:id="9" w:name="bandeau-relecture"/>
@@ -3075,7 +3075,7 @@
         <w:pStyle w:val="BodyText"/>
       </w:pPr>
       <w:r>
-        <w:t xml:space="preserve">Deux facettes de la conscience se situent à des niveaux éloignés. Il se peut que l’organisation, l’exigence ou la persévérance ne se manifestent pas avec la même intensité selon les tâches. À confirmer en entretien.</w:t>
+        <w:t xml:space="preserve">Deux facettes de la conscienciosité se situent à des niveaux éloignés. Il se peut que l’organisation, l’exigence ou la persévérance ne se manifestent pas avec la même intensité selon les tâches. À confirmer en entretien.</w:t>
       </w:r>
     </w:p>
     <w:p>
@@ -31225,7 +31225,7 @@
         <w:pStyle w:val="BodyText"/>
       </w:pPr>
       <w:r>
-        <w:t xml:space="preserve">Domaine C (rigueur et constance, conscience) : plutôt haut ou haut pour AM, KB et HT ; plutôt bas ou bas pour aucune personne.</w:t>
+        <w:t xml:space="preserve">Domaine C (rigueur et constance, conscienciosité) : plutôt haut ou haut pour AM, KB et HT ; plutôt bas ou bas pour aucune personne.</w:t>
       </w:r>
     </w:p>
     <w:bookmarkEnd w:id="636"/>
@@ -31425,7 +31425,7 @@
         <w:pStyle w:val="BodyText"/>
       </w:pPr>
       <w:r>
-        <w:t xml:space="preserve">Pour une tâche de projet à échéances, il se peut que le suivi des engagements et la circulation de l’information entre les personnes pèsent davantage que les préférences de style. Dans cette équipe, AM, KB et HT se situent plutôt haut ou haut sur le domaine C (rigueur et constance, conscience) ; AM et SR se situent plutôt haut ou haut sur le domaine E (énergie relationnelle, extraversion).</w:t>
+        <w:t xml:space="preserve">Pour une tâche de projet à échéances, il se peut que le suivi des engagements et la circulation de l’information entre les personnes pèsent davantage que les préférences de style. Dans cette équipe, AM, KB et HT se situent plutôt haut ou haut sur le domaine C (rigueur et constance, conscienciosité) ; AM et SR se situent plutôt haut ou haut sur le domaine E (énergie relationnelle, extraversion).</w:t>
       </w:r>
     </w:p>
     <w:p>
@@ -32035,7 +32035,7 @@
         <w:pStyle w:val="BodyText"/>
       </w:pPr>
       <w:r>
-        <w:t xml:space="preserve">Ce risque tient à un délai extérieur à l’équipe. Il se peut que la part maîtrisable du risque (qualité du dossier, relances, suivi) soit déterminante : AM, KB et HT se situent plutôt haut ou haut sur le domaine C (rigueur et constance, conscience), ce qui reste à confirmer en entretien.</w:t>
+        <w:t xml:space="preserve">Ce risque tient à un délai extérieur à l’équipe. Il se peut que la part maîtrisable du risque (qualité du dossier, relances, suivi) soit déterminante : AM, KB et HT se situent plutôt haut ou haut sur le domaine C (rigueur et constance, conscienciosité), ce qui reste à confirmer en entretien.</w:t>
       </w:r>
     </w:p>
     <w:p>
@@ -32221,7 +32221,7 @@
         <w:pStyle w:val="BodyText"/>
       </w:pPr>
       <w:r>
-        <w:t xml:space="preserve">Avec des échéances rapprochées, il se peut que les écarts de rythme entre personnes pèsent davantage à l’approche des dates. En position de rigueur : AM, KB et HT se situent plutôt haut ou haut sur le domaine C (rigueur et constance, conscience).</w:t>
+        <w:t xml:space="preserve">Avec des échéances rapprochées, il se peut que les écarts de rythme entre personnes pèsent davantage à l’approche des dates. En position de rigueur : AM, KB et HT se situent plutôt haut ou haut sur le domaine C (rigueur et constance, conscienciosité).</w:t>
       </w:r>
     </w:p>
     <w:p>
@@ -33169,7 +33169,7 @@
         <w:pStyle w:val="BodyText"/>
       </w:pPr>
       <w:r>
-        <w:t xml:space="preserve">Domaine C (rigueur et constance, conscience) : la position d’ensemble de l’équipe se situe au niveau plutôt haut. Répartition des niveaux individuels : 1 au milieu de l’échelle, 1 au niveau plutôt haut et 2 au niveau haut.</w:t>
+        <w:t xml:space="preserve">Domaine C (rigueur et constance, conscienciosité) : la position d’ensemble de l’équipe se situe au niveau plutôt haut. Répartition des niveaux individuels : 1 au milieu de l’échelle, 1 au niveau plutôt haut et 2 au niveau haut.</w:t>
       </w:r>
     </w:p>
     <w:bookmarkEnd w:id="691"/>
@@ -33187,7 +33187,7 @@
         <w:pStyle w:val="BodyText"/>
       </w:pPr>
       <w:r>
-        <w:t xml:space="preserve">La position d’ensemble ne décrit aucune personne : elle masque la dispersion individuelle. Les domaines où elle se situe plutôt haut ou haut sont le domaine E (énergie relationnelle, extraversion), le domaine O (ouverture) et le domaine C (rigueur et constance, conscience) ; ce sont les domaines dominants de l’ensemble au sens de cette lecture, et non des traits de l’organisation.</w:t>
+        <w:t xml:space="preserve">La position d’ensemble ne décrit aucune personne : elle masque la dispersion individuelle. Les domaines où elle se situe plutôt haut ou haut sont le domaine E (énergie relationnelle, extraversion), le domaine O (ouverture) et le domaine C (rigueur et constance, conscienciosité) ; ce sont les domaines dominants de l’ensemble au sens de cette lecture, et non des traits de l’organisation.</w:t>
       </w:r>
     </w:p>
     <w:p>
@@ -33465,7 +33465,7 @@
         <w:pStyle w:val="BodyText"/>
       </w:pPr>
       <w:r>
-        <w:t xml:space="preserve">Les lectures de structure et de culture valorisent la maîtrise des processus, quand l’orientation sollicite la nouveauté. En position d’ensemble, le domaine C (rigueur et constance, conscience) se situe au niveau plutôt haut et le domaine O (ouverture) au niveau plutôt haut : l’ensemble dispose, au niveau agrégé, des deux ressources. Selon le modèle de congruence (Nadler et Tushman), la question porte alors moins sur les profils que sur l’espace laissé à l’ouverture dans un cadre de processus standardisés.</w:t>
+        <w:t xml:space="preserve">Les lectures de structure et de culture valorisent la maîtrise des processus, quand l’orientation sollicite la nouveauté. En position d’ensemble, le domaine C (rigueur et constance, conscienciosité) se situe au niveau plutôt haut et le domaine O (ouverture) au niveau plutôt haut : l’ensemble dispose, au niveau agrégé, des deux ressources. Selon le modèle de congruence (Nadler et Tushman), la question porte alors moins sur les profils que sur l’espace laissé à l’ouverture dans un cadre de processus standardisés.</w:t>
       </w:r>
     </w:p>
     <w:p>

</xml_diff>

<commit_message>
Rapport cabinet : structure de l'équipe, liens déclarés et comment les développer
Nouvelle section du niveau équipe, entre « Mécanismes de décision » et « Sécurité
psychologique », calculée sur les liens déclarés au cas, pour toute équipe :
- densité des liens et paires sans lien direct ;
- charge de liens par personne, pondérée par la fréquence (convention écrite dans le texte) ;
- chaînes de séquence et personnes relais, liens rares ;
- leviers pour développer la structure, chacun avec sa vérification en entretien ;
- annonce de l'étape 2 : relevé du réseau réel (consentement spécifique, loi 09-08).
Carte des liens en SVG (épaisseur = fréquence, flèche = sens, tirets = mise en commun),
avec son tableau. Références ajoutées « à contrôler » : Krackhardt et Hanson 1993,
Cross et Parker 2004. Audit : 0 défaut ; 276 tests.

Claude-Session: https://claude.ai/code/session_0173ZZiGgKQsBo3M4cbm5VpC
</commit_message>
<xml_diff>
--- a/docs/design/rapport-cabinet/sortie/rapport-cabinet.docx
+++ b/docs/design/rapport-cabinet/sortie/rapport-cabinet.docx
@@ -10,7 +10,7 @@
         <w:t xml:space="preserve">Rapport cabinet : Démo Distribution Maroc (fictif)</w:t>
       </w:r>
     </w:p>
-    <w:bookmarkStart w:id="804" w:name="Xe99d78bec69305212a71ca2463758703feefa1a"/>
+    <w:bookmarkStart w:id="814" w:name="Xe99d78bec69305212a71ca2463758703feefa1a"/>
     <w:p>
       <w:pPr>
         <w:pStyle w:val="Heading1"/>
@@ -51,7 +51,7 @@
         <w:t xml:space="preserve"> </w:t>
       </w:r>
       <w:r>
-        <w:t xml:space="preserve">85 textes types en attente de relecture, 12 références à contrôler. Relecture et signature : à faire.</w:t>
+        <w:t xml:space="preserve">85 textes types en attente de relecture, 14 références à contrôler. Relecture et signature : à faire.</w:t>
       </w:r>
     </w:p>
     <w:bookmarkEnd w:id="9"/>
@@ -30142,8 +30142,8 @@
     <w:bookmarkEnd w:id="618"/>
     <w:bookmarkEnd w:id="619"/>
     <w:bookmarkEnd w:id="620"/>
-    <w:bookmarkStart w:id="680" w:name="n3-equipe"/>
-    <w:bookmarkStart w:id="679" w:name="analyse-déquipe"/>
+    <w:bookmarkStart w:id="690" w:name="n3-equipe"/>
+    <w:bookmarkStart w:id="689" w:name="analyse-déquipe"/>
     <w:p>
       <w:pPr>
         <w:pStyle w:val="Heading2"/>
@@ -31238,16 +31238,316 @@
     </w:p>
     <w:bookmarkEnd w:id="658"/>
     <w:bookmarkEnd w:id="659"/>
-    <w:bookmarkStart w:id="663" w:name="n3-securite-psychologique"/>
+    <w:bookmarkStart w:id="669" w:name="n3-structure"/>
     <w:p>
       <w:pPr>
         <w:pStyle w:val="Heading3"/>
       </w:pPr>
       <w:r>
+        <w:t xml:space="preserve">Structure de l’équipe : liens déclarés et comment les développer</w:t>
+      </w:r>
+    </w:p>
+    <w:bookmarkStart w:id="660" w:name="n3-structure-1"/>
+    <w:p>
+      <w:pPr>
+        <w:pStyle w:val="FirstParagraph"/>
+      </w:pPr>
+      <w:r>
+        <w:t xml:space="preserve">Constaté</w:t>
+      </w:r>
+    </w:p>
+    <w:p>
+      <w:pPr>
+        <w:pStyle w:val="BodyText"/>
+      </w:pPr>
+      <w:r>
+        <w:t xml:space="preserve">Cette section lit les liens de travail déclarés au cas (nature, sens, fréquence, interdépendance) : ils décrivent la structure prévue de l’équipe. Le réseau réel, c’est-à-dire à qui chacun demande conseil, à qui il fait confiance et par où l’information circule vraiment, n’est pas mesuré ici ; il peut s’écarter nettement de la structure prévue (réseau informel au sens de Krackhardt et Hanson, 1993).</w:t>
+      </w:r>
+    </w:p>
+    <w:bookmarkEnd w:id="660"/>
+    <w:bookmarkStart w:id="661" w:name="n3-structure-2"/>
+    <w:p>
+      <w:pPr>
+        <w:pStyle w:val="BodyText"/>
+      </w:pPr>
+      <w:r>
+        <w:t xml:space="preserve">Constaté</w:t>
+      </w:r>
+    </w:p>
+    <w:p>
+      <w:pPr>
+        <w:pStyle w:val="BodyText"/>
+      </w:pPr>
+      <w:r>
+        <w:t xml:space="preserve">6 liens déclarés sur 6 paires possibles entre les personnes ayant consenti. Chaque paire a un lien déclaré.</w:t>
+      </w:r>
+    </w:p>
+    <w:bookmarkEnd w:id="661"/>
+    <w:bookmarkStart w:id="662" w:name="n3-structure-3"/>
+    <w:p>
+      <w:pPr>
+        <w:pStyle w:val="BodyText"/>
+      </w:pPr>
+      <w:r>
+        <w:t xml:space="preserve">Constaté</w:t>
+      </w:r>
+    </w:p>
+    <w:p>
+      <w:pPr>
+        <w:pStyle w:val="BodyText"/>
+      </w:pPr>
+      <w:r>
+        <w:t xml:space="preserve">Liens déclarés par personne, et leur fréquence : AM, 3 liens (1 quotidien, 1 hebdomadaire et 1 mensuel) ; KB, 3 liens (1 quotidien et 2 hebdomadaires) ; SR, 3 liens (1 quotidien et 2 hebdomadaires) ; HT, 3 liens (1 quotidien, 1 hebdomadaire et 1 mensuel).</w:t>
+      </w:r>
+    </w:p>
+    <w:bookmarkEnd w:id="662"/>
+    <w:bookmarkStart w:id="663" w:name="n3-structure-4"/>
+    <w:p>
+      <w:pPr>
+        <w:pStyle w:val="BodyText"/>
+      </w:pPr>
+      <w:r>
+        <w:t xml:space="preserve">Constaté</w:t>
+      </w:r>
+    </w:p>
+    <w:p>
+      <w:pPr>
+        <w:pStyle w:val="BodyText"/>
+      </w:pPr>
+      <w:r>
+        <w:t xml:space="preserve">Liens de séquence orientés (le travail de la première personne alimente celui de la seconde) : AM vers KB ; KB vers SR.</w:t>
+      </w:r>
+    </w:p>
+    <w:bookmarkEnd w:id="663"/>
+    <w:bookmarkStart w:id="664" w:name="n3-structure-5"/>
+    <w:p>
+      <w:pPr>
+        <w:pStyle w:val="BodyText"/>
+      </w:pPr>
+      <w:r>
+        <w:t xml:space="preserve">Hypothèse</w:t>
+      </w:r>
+    </w:p>
+    <w:p>
+      <w:pPr>
+        <w:pStyle w:val="BodyText"/>
+      </w:pPr>
+      <w:r>
+        <w:t xml:space="preserve">KB se situe au milieu d’une chaîne de séquence déclarée (AM vers KB vers SR). Il se peut que les retards et les informations incomplètes de l’amont se concentrent à ce point de passage, et que ce rôle de relais n’apparaisse dans aucun organigramme ni dans aucune fiche de poste.</w:t>
+      </w:r>
+    </w:p>
+    <w:p>
+      <w:pPr>
+        <w:pStyle w:val="DefinitionTerm"/>
+      </w:pPr>
+      <w:r>
+        <w:t xml:space="preserve">Confiance</w:t>
+      </w:r>
+    </w:p>
+    <w:p>
+      <w:pPr>
+        <w:pStyle w:val="Definition"/>
+      </w:pPr>
+      <w:r>
+        <w:t xml:space="preserve">faible</w:t>
+      </w:r>
+    </w:p>
+    <w:p>
+      <w:pPr>
+        <w:pStyle w:val="DefinitionTerm"/>
+      </w:pPr>
+      <w:r>
+        <w:t xml:space="preserve">Vérification</w:t>
+      </w:r>
+    </w:p>
+    <w:p>
+      <w:pPr>
+        <w:pStyle w:val="Definition"/>
+      </w:pPr>
+      <w:r>
+        <w:t xml:space="preserve">Demander à KB ce qu’il reçoit de l’amont, sous quelle forme et avec quel délai, et ce qu’il doit reprendre ou compléter avant de transmettre.</w:t>
+      </w:r>
+    </w:p>
+    <w:bookmarkEnd w:id="664"/>
+    <w:bookmarkStart w:id="665" w:name="n3-structure-6"/>
+    <w:p>
+      <w:pPr>
+        <w:pStyle w:val="FirstParagraph"/>
+      </w:pPr>
+      <w:r>
+        <w:t xml:space="preserve">Hypothèse</w:t>
+      </w:r>
+    </w:p>
+    <w:p>
+      <w:pPr>
+        <w:pStyle w:val="BodyText"/>
+      </w:pPr>
+      <w:r>
+        <w:t xml:space="preserve">En pondérant chaque lien par sa fréquence (quotidien 3, hebdomadaire 2, mensuel 1, convention de ce rapport), KB et SR portent la charge de liens la plus élevée de l’équipe. Il se peut que la coordination repose davantage sur ces personnes, et qu’une absence y produise un blocage que la structure prévue ne montre pas.</w:t>
+      </w:r>
+    </w:p>
+    <w:p>
+      <w:pPr>
+        <w:pStyle w:val="DefinitionTerm"/>
+      </w:pPr>
+      <w:r>
+        <w:t xml:space="preserve">Confiance</w:t>
+      </w:r>
+    </w:p>
+    <w:p>
+      <w:pPr>
+        <w:pStyle w:val="Definition"/>
+      </w:pPr>
+      <w:r>
+        <w:t xml:space="preserve">faible</w:t>
+      </w:r>
+    </w:p>
+    <w:p>
+      <w:pPr>
+        <w:pStyle w:val="DefinitionTerm"/>
+      </w:pPr>
+      <w:r>
+        <w:t xml:space="preserve">Vérification</w:t>
+      </w:r>
+    </w:p>
+    <w:p>
+      <w:pPr>
+        <w:pStyle w:val="Definition"/>
+      </w:pPr>
+      <w:r>
+        <w:t xml:space="preserve">Demander à l’équipe ce qui s’est passé la dernière fois que KB ou SR était absent, et qui a pris le relais.</w:t>
+      </w:r>
+    </w:p>
+    <w:bookmarkEnd w:id="665"/>
+    <w:bookmarkStart w:id="666" w:name="n3-structure-7"/>
+    <w:p>
+      <w:pPr>
+        <w:pStyle w:val="FirstParagraph"/>
+      </w:pPr>
+      <w:r>
+        <w:t xml:space="preserve">Hypothèse</w:t>
+      </w:r>
+    </w:p>
+    <w:p>
+      <w:pPr>
+        <w:pStyle w:val="BodyText"/>
+      </w:pPr>
+      <w:r>
+        <w:t xml:space="preserve">Lien à fréquence mensuelle : AM-HT (mentorat). Il se peut qu’un lien aussi espacé laisse passer des questions sans réponse entre deux rencontres, et que l’échange réel passe alors par une tierce personne.</w:t>
+      </w:r>
+    </w:p>
+    <w:p>
+      <w:pPr>
+        <w:pStyle w:val="DefinitionTerm"/>
+      </w:pPr>
+      <w:r>
+        <w:t xml:space="preserve">Confiance</w:t>
+      </w:r>
+    </w:p>
+    <w:p>
+      <w:pPr>
+        <w:pStyle w:val="Definition"/>
+      </w:pPr>
+      <w:r>
+        <w:t xml:space="preserve">faible</w:t>
+      </w:r>
+    </w:p>
+    <w:p>
+      <w:pPr>
+        <w:pStyle w:val="DefinitionTerm"/>
+      </w:pPr>
+      <w:r>
+        <w:t xml:space="preserve">Vérification</w:t>
+      </w:r>
+    </w:p>
+    <w:p>
+      <w:pPr>
+        <w:pStyle w:val="Definition"/>
+      </w:pPr>
+      <w:r>
+        <w:t xml:space="preserve">Demander aux personnes concernées comment elles se joignent entre deux rencontres prévues, et par qui passe l’information dans l’intervalle.</w:t>
+      </w:r>
+    </w:p>
+    <w:bookmarkEnd w:id="666"/>
+    <w:bookmarkStart w:id="667" w:name="n3-structure-8"/>
+    <w:p>
+      <w:pPr>
+        <w:pStyle w:val="FirstParagraph"/>
+      </w:pPr>
+      <w:r>
+        <w:t xml:space="preserve">Hypothèse</w:t>
+      </w:r>
+    </w:p>
+    <w:p>
+      <w:pPr>
+        <w:pStyle w:val="BodyText"/>
+      </w:pPr>
+      <w:r>
+        <w:t xml:space="preserve">Leviers pour développer cette structure, à choisir avec l’équipe et non à imposer : rendre visible et partager la charge de relais de KB (un point de passage écrit, une personne de suppléance désignée) ; organiser une suppléance pour KB et SR, afin qu’aucune décision ne dépende d’une seule présence ; installer un canal d’échange entre deux rencontres sur le lien AM-HT. Le réseau informel se développe par des occasions de travail réelles, non par un organigramme ; Cross et Parker (2004) décrivent ce travail à partir des personnes centrales, des intermédiaires et des personnes en périphérie.</w:t>
+      </w:r>
+    </w:p>
+    <w:p>
+      <w:pPr>
+        <w:pStyle w:val="DefinitionTerm"/>
+      </w:pPr>
+      <w:r>
+        <w:t xml:space="preserve">Confiance</w:t>
+      </w:r>
+    </w:p>
+    <w:p>
+      <w:pPr>
+        <w:pStyle w:val="Definition"/>
+      </w:pPr>
+      <w:r>
+        <w:t xml:space="preserve">faible</w:t>
+      </w:r>
+    </w:p>
+    <w:p>
+      <w:pPr>
+        <w:pStyle w:val="DefinitionTerm"/>
+      </w:pPr>
+      <w:r>
+        <w:t xml:space="preserve">Vérification</w:t>
+      </w:r>
+    </w:p>
+    <w:p>
+      <w:pPr>
+        <w:pStyle w:val="Definition"/>
+      </w:pPr>
+      <w:r>
+        <w:t xml:space="preserve">Soumettre ces leviers à l’équipe et lui demander lesquels répondent à une difficulté qu’elle a déjà rencontrée, et lesquels seraient une charge de plus.</w:t>
+      </w:r>
+    </w:p>
+    <w:bookmarkEnd w:id="667"/>
+    <w:bookmarkStart w:id="668" w:name="n3-structure-9"/>
+    <w:p>
+      <w:pPr>
+        <w:pStyle w:val="FirstParagraph"/>
+      </w:pPr>
+      <w:r>
+        <w:t xml:space="preserve">Constaté</w:t>
+      </w:r>
+    </w:p>
+    <w:p>
+      <w:pPr>
+        <w:pStyle w:val="BodyText"/>
+      </w:pPr>
+      <w:r>
+        <w:t xml:space="preserve">Étape suivante proposée, non réalisée dans ce rapport : relever le réseau réel par quatre ou cinq questions posées à chaque membre (à qui il demande conseil, d’où lui vient l’information utile, à qui il fait confiance, qui le bloque), avec un consentement spécifique, puisque chaque réponse porte sur des collègues, et un cadrage au titre de la loi 09-08. La comparaison entre la structure prévue et le réseau réel est la seule lecture directe de la structure invisible de l’équipe.</w:t>
+      </w:r>
+    </w:p>
+    <w:bookmarkEnd w:id="668"/>
+    <w:bookmarkEnd w:id="669"/>
+    <w:bookmarkStart w:id="673" w:name="n3-securite-psychologique"/>
+    <w:p>
+      <w:pPr>
+        <w:pStyle w:val="Heading3"/>
+      </w:pPr>
+      <w:r>
         <w:t xml:space="preserve">Sécurité psychologique à instruire</w:t>
       </w:r>
     </w:p>
-    <w:bookmarkStart w:id="660" w:name="n3-securite-psychologique-1"/>
+    <w:bookmarkStart w:id="670" w:name="n3-securite-psychologique-1"/>
     <w:p>
       <w:pPr>
         <w:pStyle w:val="FirstParagraph"/>
@@ -31264,8 +31564,8 @@
         <w:t xml:space="preserve">Les profils mesurent des préférences de comportement ; ils ne mesurent pas la sécurité psychologique, c’est-à-dire la croyance partagée qu’on peut prendre la parole, signaler une erreur ou poser une question sans risque (notion d’Edmondson). Elle s’instruit par entretien et par observation, jamais par déduction à partir d’un profil.</w:t>
       </w:r>
     </w:p>
-    <w:bookmarkEnd w:id="660"/>
-    <w:bookmarkStart w:id="661" w:name="n3-securite-psychologique-2"/>
+    <w:bookmarkEnd w:id="670"/>
+    <w:bookmarkStart w:id="671" w:name="n3-securite-psychologique-2"/>
     <w:p>
       <w:pPr>
         <w:pStyle w:val="BodyText"/>
@@ -31282,8 +31582,8 @@
         <w:t xml:space="preserve">Éléments du cas qui invitent à l’instruire : CT-09 : un précédent outil d’évaluation, introduit avant le rachat, a laissé de la méfiance dans les équipes ; des liens de ligne ou de mentorat au sein de l’équipe (AM-KB ; AM-HT) ; des langues de passation différentes.</w:t>
       </w:r>
     </w:p>
-    <w:bookmarkEnd w:id="661"/>
-    <w:bookmarkStart w:id="662" w:name="n3-securite-psychologique-3"/>
+    <w:bookmarkEnd w:id="671"/>
+    <w:bookmarkStart w:id="672" w:name="n3-securite-psychologique-3"/>
     <w:p>
       <w:pPr>
         <w:pStyle w:val="BodyText"/>
@@ -31332,9 +31632,9 @@
         <w:t xml:space="preserve">Conduire des entretiens individuels courts autour d’une question commune, « Que se passe-t-il ici quand quelqu’un signale une erreur ? », puis observer deux réunions.</w:t>
       </w:r>
     </w:p>
-    <w:bookmarkEnd w:id="662"/>
-    <w:bookmarkEnd w:id="663"/>
-    <w:bookmarkStart w:id="672" w:name="n3-coordination"/>
+    <w:bookmarkEnd w:id="672"/>
+    <w:bookmarkEnd w:id="673"/>
+    <w:bookmarkStart w:id="682" w:name="n3-coordination"/>
     <w:p>
       <w:pPr>
         <w:pStyle w:val="Heading3"/>
@@ -31343,7 +31643,7 @@
         <w:t xml:space="preserve">Risques de coordination</w:t>
       </w:r>
     </w:p>
-    <w:bookmarkStart w:id="664" w:name="n3-coordination-1"/>
+    <w:bookmarkStart w:id="674" w:name="n3-coordination-1"/>
     <w:p>
       <w:pPr>
         <w:pStyle w:val="FirstParagraph"/>
@@ -31360,8 +31660,8 @@
         <w:t xml:space="preserve">Risque inscrit au cas : délai d’autorisation de la CNDP non maîtrisé par l’équipe.</w:t>
       </w:r>
     </w:p>
-    <w:bookmarkEnd w:id="664"/>
-    <w:bookmarkStart w:id="665" w:name="n3-coordination-2"/>
+    <w:bookmarkEnd w:id="674"/>
+    <w:bookmarkStart w:id="675" w:name="n3-coordination-2"/>
     <w:p>
       <w:pPr>
         <w:pStyle w:val="BodyText"/>
@@ -31410,8 +31710,8 @@
         <w:t xml:space="preserve">Demander qui suit le dossier, comment les relances sont organisées et quelle part du délai l’équipe estime maîtrisable.</w:t>
       </w:r>
     </w:p>
-    <w:bookmarkEnd w:id="665"/>
-    <w:bookmarkStart w:id="666" w:name="n3-coordination-3"/>
+    <w:bookmarkEnd w:id="675"/>
+    <w:bookmarkStart w:id="676" w:name="n3-coordination-3"/>
     <w:p>
       <w:pPr>
         <w:pStyle w:val="FirstParagraph"/>
@@ -31428,8 +31728,8 @@
         <w:t xml:space="preserve">Risque inscrit au cas : décisions du siège tardives en raison du décalage horaire et de la langue de travail du groupe.</w:t>
       </w:r>
     </w:p>
-    <w:bookmarkEnd w:id="666"/>
-    <w:bookmarkStart w:id="667" w:name="n3-coordination-4"/>
+    <w:bookmarkEnd w:id="676"/>
+    <w:bookmarkStart w:id="677" w:name="n3-coordination-4"/>
     <w:p>
       <w:pPr>
         <w:pStyle w:val="BodyText"/>
@@ -31478,8 +31778,8 @@
         <w:t xml:space="preserve">Demander quelles décisions ont attendu le plus longtemps la validation du siège, et pour quelle raison.</w:t>
       </w:r>
     </w:p>
-    <w:bookmarkEnd w:id="667"/>
-    <w:bookmarkStart w:id="668" w:name="n3-coordination-5"/>
+    <w:bookmarkEnd w:id="677"/>
+    <w:bookmarkStart w:id="678" w:name="n3-coordination-5"/>
     <w:p>
       <w:pPr>
         <w:pStyle w:val="FirstParagraph"/>
@@ -31496,8 +31796,8 @@
         <w:t xml:space="preserve">Risque inscrit au cas : méfiance des équipes héritée de l’ancien outil d’évaluation.</w:t>
       </w:r>
     </w:p>
-    <w:bookmarkEnd w:id="668"/>
-    <w:bookmarkStart w:id="669" w:name="n3-coordination-6"/>
+    <w:bookmarkEnd w:id="678"/>
+    <w:bookmarkStart w:id="679" w:name="n3-coordination-6"/>
     <w:p>
       <w:pPr>
         <w:pStyle w:val="BodyText"/>
@@ -31546,8 +31846,8 @@
         <w:t xml:space="preserve">Demander aux membres de l’équipe ce qu’ils craignent que l’on fasse des résultats, et ce qui les rassurerait.</w:t>
       </w:r>
     </w:p>
-    <w:bookmarkEnd w:id="669"/>
-    <w:bookmarkStart w:id="670" w:name="n3-coordination-7"/>
+    <w:bookmarkEnd w:id="679"/>
+    <w:bookmarkStart w:id="680" w:name="n3-coordination-7"/>
     <w:p>
       <w:pPr>
         <w:pStyle w:val="FirstParagraph"/>
@@ -31596,8 +31896,8 @@
         <w:t xml:space="preserve">Demander à l’équipe comment elle gère un retard de l’un de ses membres à l’approche d’une échéance.</w:t>
       </w:r>
     </w:p>
-    <w:bookmarkEnd w:id="670"/>
-    <w:bookmarkStart w:id="671" w:name="n3-coordination-8"/>
+    <w:bookmarkEnd w:id="680"/>
+    <w:bookmarkStart w:id="681" w:name="n3-coordination-8"/>
     <w:p>
       <w:pPr>
         <w:pStyle w:val="FirstParagraph"/>
@@ -31646,9 +31946,9 @@
         <w:t xml:space="preserve">Soumettre cette liste à l’équipe et lui demander lesquels de ces points elle reconnaît, lesquels manquent.</w:t>
       </w:r>
     </w:p>
-    <w:bookmarkEnd w:id="671"/>
-    <w:bookmarkEnd w:id="672"/>
-    <w:bookmarkStart w:id="678" w:name="recommandations-2"/>
+    <w:bookmarkEnd w:id="681"/>
+    <w:bookmarkEnd w:id="682"/>
+    <w:bookmarkStart w:id="688" w:name="recommandations-2"/>
     <w:p>
       <w:pPr>
         <w:pStyle w:val="Heading3"/>
@@ -31657,7 +31957,7 @@
         <w:t xml:space="preserve">Recommandations</w:t>
       </w:r>
     </w:p>
-    <w:bookmarkStart w:id="673" w:name="X3e438d5fcc26fef8132c5f3b0255cd53c6340c1"/>
+    <w:bookmarkStart w:id="683" w:name="X3e438d5fcc26fef8132c5f3b0255cd53c6340c1"/>
     <w:p>
       <w:pPr>
         <w:pStyle w:val="Heading4"/>
@@ -31778,8 +32078,8 @@
         <w:t xml:space="preserve">Suppléant nommé par écrit pour chaque rôle, vérifié à la revue des 30 jours.</w:t>
       </w:r>
     </w:p>
-    <w:bookmarkEnd w:id="673"/>
-    <w:bookmarkStart w:id="674" w:name="X7b6c3c416c89dd842c40a43705314ebdc3ce105"/>
+    <w:bookmarkEnd w:id="683"/>
+    <w:bookmarkStart w:id="684" w:name="X7b6c3c416c89dd842c40a43705314ebdc3ce105"/>
     <w:p>
       <w:pPr>
         <w:pStyle w:val="Heading4"/>
@@ -31917,8 +32217,8 @@
         <w:t xml:space="preserve">Part des décisions du point consignées avec leur décideur, relevée à 30 puis 60 jours.</w:t>
       </w:r>
     </w:p>
-    <w:bookmarkEnd w:id="674"/>
-    <w:bookmarkStart w:id="675" w:name="Xc2235b2559351dbf0435ba0db8266b03fded916"/>
+    <w:bookmarkEnd w:id="684"/>
+    <w:bookmarkStart w:id="685" w:name="Xc2235b2559351dbf0435ba0db8266b03fded916"/>
     <w:p>
       <w:pPr>
         <w:pStyle w:val="Heading4"/>
@@ -32056,8 +32356,8 @@
         <w:t xml:space="preserve">Synthèse des entretiens restituée à l’équipe, puis réponse de chaque personne à la question commune « Que se passe-t-il ici quand quelqu’un signale une erreur ? », relevée à 60 puis 90 jours.</w:t>
       </w:r>
     </w:p>
-    <w:bookmarkEnd w:id="675"/>
-    <w:bookmarkStart w:id="676" w:name="X00bc83238364f3411cdf6ddcb124617f7223823"/>
+    <w:bookmarkEnd w:id="685"/>
+    <w:bookmarkStart w:id="686" w:name="X00bc83238364f3411cdf6ddcb124617f7223823"/>
     <w:p>
       <w:pPr>
         <w:pStyle w:val="Heading4"/>
@@ -32178,8 +32478,8 @@
         <w:t xml:space="preserve">Nombre de risques inscrits et de décisions de traitement prises en revue, relevé à chaque revue sur 30 jours puis 60 jours.</w:t>
       </w:r>
     </w:p>
-    <w:bookmarkEnd w:id="676"/>
-    <w:bookmarkStart w:id="677" w:name="X26e0eef1dae72cfdaf971167d0723d7171fdde6"/>
+    <w:bookmarkEnd w:id="686"/>
+    <w:bookmarkStart w:id="687" w:name="X26e0eef1dae72cfdaf971167d0723d7171fdde6"/>
     <w:p>
       <w:pPr>
         <w:pStyle w:val="Heading4"/>
@@ -32300,12 +32600,12 @@
         <w:t xml:space="preserve">Date du dernier recalcul comparée à la date du dernier changement de consentement, relevée avant chaque diffusion.</w:t>
       </w:r>
     </w:p>
-    <w:bookmarkEnd w:id="677"/>
-    <w:bookmarkEnd w:id="678"/>
-    <w:bookmarkEnd w:id="679"/>
-    <w:bookmarkEnd w:id="680"/>
-    <w:bookmarkStart w:id="741" w:name="n4-organisation"/>
-    <w:bookmarkStart w:id="740" w:name="lecture-organisationnelle"/>
+    <w:bookmarkEnd w:id="687"/>
+    <w:bookmarkEnd w:id="688"/>
+    <w:bookmarkEnd w:id="689"/>
+    <w:bookmarkEnd w:id="690"/>
+    <w:bookmarkStart w:id="751" w:name="n4-organisation"/>
+    <w:bookmarkStart w:id="750" w:name="lecture-organisationnelle"/>
     <w:p>
       <w:pPr>
         <w:pStyle w:val="Heading2"/>
@@ -32314,7 +32614,7 @@
         <w:t xml:space="preserve">Lecture organisationnelle</w:t>
       </w:r>
     </w:p>
-    <w:bookmarkStart w:id="685" w:name="n4-seuil"/>
+    <w:bookmarkStart w:id="695" w:name="n4-seuil"/>
     <w:p>
       <w:pPr>
         <w:pStyle w:val="Heading3"/>
@@ -32323,7 +32623,7 @@
         <w:t xml:space="preserve">Seuil d’anonymat et dérogation de démonstration</w:t>
       </w:r>
     </w:p>
-    <w:bookmarkStart w:id="681" w:name="n4-seuil-1"/>
+    <w:bookmarkStart w:id="691" w:name="n4-seuil-1"/>
     <w:p>
       <w:pPr>
         <w:pStyle w:val="FirstParagraph"/>
@@ -32340,8 +32640,8 @@
         <w:t xml:space="preserve">Le seuil d’anonymat de 5 personnes n’est pas atteint : l’effectif de ce cas est de 4 personnes. En dessous de ce seuil, un agrégat permettrait de retrouver des personnes.</w:t>
       </w:r>
     </w:p>
-    <w:bookmarkEnd w:id="681"/>
-    <w:bookmarkStart w:id="682" w:name="n4-seuil-2"/>
+    <w:bookmarkEnd w:id="691"/>
+    <w:bookmarkStart w:id="692" w:name="n4-seuil-2"/>
     <w:p>
       <w:pPr>
         <w:pStyle w:val="BodyText"/>
@@ -32358,8 +32658,8 @@
         <w:t xml:space="preserve">Agrégat montré malgré un effectif de 4 personnes, inférieur au seuil de 5, uniquement parce que le cas est fictif et consenti. Cette dérogation ne s’applique à aucune organisation réelle.</w:t>
       </w:r>
     </w:p>
-    <w:bookmarkEnd w:id="682"/>
-    <w:bookmarkStart w:id="683" w:name="n4-seuil-3"/>
+    <w:bookmarkEnd w:id="692"/>
+    <w:bookmarkStart w:id="693" w:name="n4-seuil-3"/>
     <w:p>
       <w:pPr>
         <w:pStyle w:val="BodyText"/>
@@ -32376,8 +32676,8 @@
         <w:t xml:space="preserve">Précision : le cas est fictif, à l’exception du profil estimé de AM, consenti (estimation, pas une mesure).</w:t>
       </w:r>
     </w:p>
-    <w:bookmarkEnd w:id="683"/>
-    <w:bookmarkStart w:id="684" w:name="n4-seuil-4"/>
+    <w:bookmarkEnd w:id="693"/>
+    <w:bookmarkStart w:id="694" w:name="n4-seuil-4"/>
     <w:p>
       <w:pPr>
         <w:pStyle w:val="BodyText"/>
@@ -32394,9 +32694,9 @@
         <w:t xml:space="preserve">Règle de fond : cette lecture agrégée ne doit jamais être produite pour un effectif réel inférieur à 5 personnes ; la dérogation de démonstration est réservée aux cas fictifs et consentis. Ce niveau décrit l’organisation, pas les personnes, et aucune décision d’emploi ne peut s’y appuyer.</w:t>
       </w:r>
     </w:p>
-    <w:bookmarkEnd w:id="684"/>
-    <w:bookmarkEnd w:id="685"/>
-    <w:bookmarkStart w:id="693" w:name="n4-profils"/>
+    <w:bookmarkEnd w:id="694"/>
+    <w:bookmarkEnd w:id="695"/>
+    <w:bookmarkStart w:id="703" w:name="n4-profils"/>
     <w:p>
       <w:pPr>
         <w:pStyle w:val="Heading3"/>
@@ -32405,7 +32705,7 @@
         <w:t xml:space="preserve">Position d’ensemble de l’équipe</w:t>
       </w:r>
     </w:p>
-    <w:bookmarkStart w:id="686" w:name="n4-profils-1"/>
+    <w:bookmarkStart w:id="696" w:name="n4-profils-1"/>
     <w:p>
       <w:pPr>
         <w:pStyle w:val="FirstParagraph"/>
@@ -32422,8 +32722,8 @@
         <w:t xml:space="preserve">Position d’ensemble de l’équipe par domaine, d’après les niveaux conventionnels de la position d’ensemble calculée sur l’ensemble des personnes (échelle de 1 à 5, sans référence externe).</w:t>
       </w:r>
     </w:p>
-    <w:bookmarkEnd w:id="686"/>
-    <w:bookmarkStart w:id="687" w:name="n4-profils-2"/>
+    <w:bookmarkEnd w:id="696"/>
+    <w:bookmarkStart w:id="697" w:name="n4-profils-2"/>
     <w:p>
       <w:pPr>
         <w:pStyle w:val="BodyText"/>
@@ -32440,8 +32740,8 @@
         <w:t xml:space="preserve">Domaine N (névrosisme) : la position d’ensemble de l’équipe se situe au milieu de l’échelle. Répartition des niveaux individuels : 2 au niveau plutôt bas, 1 au milieu de l’échelle et 1 au niveau plutôt haut.</w:t>
       </w:r>
     </w:p>
-    <w:bookmarkEnd w:id="687"/>
-    <w:bookmarkStart w:id="688" w:name="n4-profils-3"/>
+    <w:bookmarkEnd w:id="697"/>
+    <w:bookmarkStart w:id="698" w:name="n4-profils-3"/>
     <w:p>
       <w:pPr>
         <w:pStyle w:val="BodyText"/>
@@ -32458,8 +32758,8 @@
         <w:t xml:space="preserve">Domaine E (énergie relationnelle, extraversion) : la position d’ensemble de l’équipe se situe au niveau plutôt haut. Répartition des niveaux individuels : 1 au niveau plutôt bas, 1 au milieu de l’échelle et 2 au niveau haut.</w:t>
       </w:r>
     </w:p>
-    <w:bookmarkEnd w:id="688"/>
-    <w:bookmarkStart w:id="689" w:name="n4-profils-4"/>
+    <w:bookmarkEnd w:id="698"/>
+    <w:bookmarkStart w:id="699" w:name="n4-profils-4"/>
     <w:p>
       <w:pPr>
         <w:pStyle w:val="BodyText"/>
@@ -32476,8 +32776,8 @@
         <w:t xml:space="preserve">Domaine O (ouverture) : la position d’ensemble de l’équipe se situe au niveau plutôt haut. Répartition des niveaux individuels : 1 au niveau plutôt bas, 1 au niveau plutôt haut et 2 au niveau haut.</w:t>
       </w:r>
     </w:p>
-    <w:bookmarkEnd w:id="689"/>
-    <w:bookmarkStart w:id="690" w:name="n4-profils-5"/>
+    <w:bookmarkEnd w:id="699"/>
+    <w:bookmarkStart w:id="700" w:name="n4-profils-5"/>
     <w:p>
       <w:pPr>
         <w:pStyle w:val="BodyText"/>
@@ -32494,8 +32794,8 @@
         <w:t xml:space="preserve">Domaine A (orientation vers autrui, agréabilité) : la position d’ensemble de l’équipe se situe au milieu de l’échelle. Répartition des niveaux individuels : 3 au milieu de l’échelle et 1 au niveau haut.</w:t>
       </w:r>
     </w:p>
-    <w:bookmarkEnd w:id="690"/>
-    <w:bookmarkStart w:id="691" w:name="n4-profils-6"/>
+    <w:bookmarkEnd w:id="700"/>
+    <w:bookmarkStart w:id="701" w:name="n4-profils-6"/>
     <w:p>
       <w:pPr>
         <w:pStyle w:val="BodyText"/>
@@ -32512,8 +32812,8 @@
         <w:t xml:space="preserve">Domaine C (rigueur et constance, conscienciosité) : la position d’ensemble de l’équipe se situe au niveau plutôt haut. Répartition des niveaux individuels : 1 au milieu de l’échelle, 1 au niveau plutôt haut et 2 au niveau haut.</w:t>
       </w:r>
     </w:p>
-    <w:bookmarkEnd w:id="691"/>
-    <w:bookmarkStart w:id="692" w:name="n4-profils-7"/>
+    <w:bookmarkEnd w:id="701"/>
+    <w:bookmarkStart w:id="702" w:name="n4-profils-7"/>
     <w:p>
       <w:pPr>
         <w:pStyle w:val="BodyText"/>
@@ -32562,9 +32862,9 @@
         <w:t xml:space="preserve">Confronter cette position d’ensemble à la perception du commanditaire et de l’équipe sur ce qui fonctionne et sur ce qui manque.</w:t>
       </w:r>
     </w:p>
-    <w:bookmarkEnd w:id="692"/>
-    <w:bookmarkEnd w:id="693"/>
-    <w:bookmarkStart w:id="700" w:name="n4-adequation"/>
+    <w:bookmarkEnd w:id="702"/>
+    <w:bookmarkEnd w:id="703"/>
+    <w:bookmarkStart w:id="710" w:name="n4-adequation"/>
     <w:p>
       <w:pPr>
         <w:pStyle w:val="Heading3"/>
@@ -32573,7 +32873,7 @@
         <w:t xml:space="preserve">Adéquation avec la structure, la culture et l’orientation</w:t>
       </w:r>
     </w:p>
-    <w:bookmarkStart w:id="694" w:name="n4-adequation-1"/>
+    <w:bookmarkStart w:id="704" w:name="n4-adequation-1"/>
     <w:p>
       <w:pPr>
         <w:pStyle w:val="FirstParagraph"/>
@@ -32590,8 +32890,8 @@
         <w:t xml:space="preserve">Configuration saisie au cas : structure « bureaucratie mécaniste » (Mintzberg), culture dominante « hiérarchie » (Cameron et Quinn), orientation des objectifs « croissance » (March).</w:t>
       </w:r>
     </w:p>
-    <w:bookmarkEnd w:id="694"/>
-    <w:bookmarkStart w:id="695" w:name="n4-adequation-2"/>
+    <w:bookmarkEnd w:id="704"/>
+    <w:bookmarkStart w:id="705" w:name="n4-adequation-2"/>
     <w:p>
       <w:pPr>
         <w:pStyle w:val="BodyText"/>
@@ -32640,8 +32940,8 @@
         <w:t xml:space="preserve">Confirmer en entretien avec le commanditaire et avec des membres de l’équipe que la configuration décrite correspond à ce qu’ils vivent.</w:t>
       </w:r>
     </w:p>
-    <w:bookmarkEnd w:id="695"/>
-    <w:bookmarkStart w:id="696" w:name="n4-adequation-3"/>
+    <w:bookmarkEnd w:id="705"/>
+    <w:bookmarkStart w:id="706" w:name="n4-adequation-3"/>
     <w:p>
       <w:pPr>
         <w:pStyle w:val="FirstParagraph"/>
@@ -32690,8 +32990,8 @@
         <w:t xml:space="preserve">Confirmer en entretien avec le commanditaire et avec des membres de l’équipe que la configuration décrite correspond à ce qu’ils vivent.</w:t>
       </w:r>
     </w:p>
-    <w:bookmarkEnd w:id="696"/>
-    <w:bookmarkStart w:id="697" w:name="n4-adequation-4"/>
+    <w:bookmarkEnd w:id="706"/>
+    <w:bookmarkStart w:id="707" w:name="n4-adequation-4"/>
     <w:p>
       <w:pPr>
         <w:pStyle w:val="FirstParagraph"/>
@@ -32740,8 +33040,8 @@
         <w:t xml:space="preserve">Confirmer en entretien avec le commanditaire et avec des membres de l’équipe que la configuration décrite correspond à ce qu’ils vivent.</w:t>
       </w:r>
     </w:p>
-    <w:bookmarkEnd w:id="697"/>
-    <w:bookmarkStart w:id="698" w:name="n4-adequation-5"/>
+    <w:bookmarkEnd w:id="707"/>
+    <w:bookmarkStart w:id="708" w:name="n4-adequation-5"/>
     <w:p>
       <w:pPr>
         <w:pStyle w:val="FirstParagraph"/>
@@ -32790,8 +33090,8 @@
         <w:t xml:space="preserve">Demander au commanditaire quelle part des objectifs relève de la nouveauté et quelle part de l’amélioration de l’existant.</w:t>
       </w:r>
     </w:p>
-    <w:bookmarkEnd w:id="698"/>
-    <w:bookmarkStart w:id="699" w:name="n4-adequation-6"/>
+    <w:bookmarkEnd w:id="708"/>
+    <w:bookmarkStart w:id="709" w:name="n4-adequation-6"/>
     <w:p>
       <w:pPr>
         <w:pStyle w:val="FirstParagraph"/>
@@ -32840,9 +33140,9 @@
         <w:t xml:space="preserve">Demander où, dans le fonctionnement actuel, une proposition nouvelle peut être faite, qui la reçoit et en combien de temps elle obtient une réponse.</w:t>
       </w:r>
     </w:p>
-    <w:bookmarkEnd w:id="699"/>
-    <w:bookmarkEnd w:id="700"/>
-    <w:bookmarkStart w:id="715" w:name="n4-contraintes"/>
+    <w:bookmarkEnd w:id="709"/>
+    <w:bookmarkEnd w:id="710"/>
+    <w:bookmarkStart w:id="725" w:name="n4-contraintes"/>
     <w:p>
       <w:pPr>
         <w:pStyle w:val="Heading3"/>
@@ -32851,7 +33151,7 @@
         <w:t xml:space="preserve">Contraintes et cadre juridique</w:t>
       </w:r>
     </w:p>
-    <w:bookmarkStart w:id="701" w:name="n4-contraintes-1"/>
+    <w:bookmarkStart w:id="711" w:name="n4-contraintes-1"/>
     <w:p>
       <w:pPr>
         <w:pStyle w:val="FirstParagraph"/>
@@ -32868,8 +33168,8 @@
         <w:t xml:space="preserve">Le droit marocain est la référence : loi 09-08 relative aux données à caractère personnel (contrôlée par la CNDP) et Code du travail (loi 65-99). Le groupe étant européen (cas), le RGPD et le règlement 2024/1689 sur l’intelligence artificielle peuvent aussi s’appliquer ; la règle de prudence est d’appliquer l’exigence la plus forte des deux cadres. La règle selon laquelle aucune décision d’emploi ne s’appuie sur ces rapports est posée par l’outil ; son articulation avec le Code du travail (loi 65-99) est à instruire par Tenga Conseil. Base juridique à faire instruire par Tenga Conseil avant tout usage.</w:t>
       </w:r>
     </w:p>
-    <w:bookmarkEnd w:id="701"/>
-    <w:bookmarkStart w:id="702" w:name="n4-contraintes-2"/>
+    <w:bookmarkEnd w:id="711"/>
+    <w:bookmarkStart w:id="712" w:name="n4-contraintes-2"/>
     <w:p>
       <w:pPr>
         <w:pStyle w:val="BodyText"/>
@@ -32886,8 +33186,8 @@
         <w:t xml:space="preserve">CT-01, dureté dure : Loi 09-08 : les résultats du questionnaire sont des données personnelles, information et consentement préalables des personnes.</w:t>
       </w:r>
     </w:p>
-    <w:bookmarkEnd w:id="702"/>
-    <w:bookmarkStart w:id="703" w:name="n4-contraintes-3"/>
+    <w:bookmarkEnd w:id="712"/>
+    <w:bookmarkStart w:id="713" w:name="n4-contraintes-3"/>
     <w:p>
       <w:pPr>
         <w:pStyle w:val="BodyText"/>
@@ -32904,8 +33204,8 @@
         <w:t xml:space="preserve">CT-02, dureté dure : CNDP : déclaration ou autorisation préalable du traitement avant toute analyse de relation ou d’équipe.</w:t>
       </w:r>
     </w:p>
-    <w:bookmarkEnd w:id="703"/>
-    <w:bookmarkStart w:id="704" w:name="n4-contraintes-4"/>
+    <w:bookmarkEnd w:id="713"/>
+    <w:bookmarkStart w:id="714" w:name="n4-contraintes-4"/>
     <w:p>
       <w:pPr>
         <w:pStyle w:val="BodyText"/>
@@ -32922,8 +33222,8 @@
         <w:t xml:space="preserve">CT-03, dureté dure : aucune décision d’emploi ne peut s’appuyer sur ces rapports (règle posée par l’outil ; son articulation avec le Code du travail (loi 65-99) est à instruire par Tenga Conseil).</w:t>
       </w:r>
     </w:p>
-    <w:bookmarkEnd w:id="704"/>
-    <w:bookmarkStart w:id="705" w:name="n4-contraintes-5"/>
+    <w:bookmarkEnd w:id="714"/>
+    <w:bookmarkStart w:id="715" w:name="n4-contraintes-5"/>
     <w:p>
       <w:pPr>
         <w:pStyle w:val="BodyText"/>
@@ -32940,8 +33240,8 @@
         <w:t xml:space="preserve">CT-04, dureté dure : Transfert de données vers le siège à l’étranger : cadre et autorisation à faire instruire avant tout envoi.</w:t>
       </w:r>
     </w:p>
-    <w:bookmarkEnd w:id="705"/>
-    <w:bookmarkStart w:id="706" w:name="n4-contraintes-6"/>
+    <w:bookmarkEnd w:id="715"/>
+    <w:bookmarkStart w:id="716" w:name="n4-contraintes-6"/>
     <w:p>
       <w:pPr>
         <w:pStyle w:val="BodyText"/>
@@ -32958,8 +33258,8 @@
         <w:t xml:space="preserve">CT-05, dureté dure : Calendrier de lancement fixé par le siège : 9 mois.</w:t>
       </w:r>
     </w:p>
-    <w:bookmarkEnd w:id="706"/>
-    <w:bookmarkStart w:id="707" w:name="n4-contraintes-7"/>
+    <w:bookmarkEnd w:id="716"/>
+    <w:bookmarkStart w:id="717" w:name="n4-contraintes-7"/>
     <w:p>
       <w:pPr>
         <w:pStyle w:val="BodyText"/>
@@ -32976,8 +33276,8 @@
         <w:t xml:space="preserve">CT-06, dureté négociable : Enveloppe d’accompagnement plafonnée sur 12 mois.</w:t>
       </w:r>
     </w:p>
-    <w:bookmarkEnd w:id="707"/>
-    <w:bookmarkStart w:id="708" w:name="n4-contraintes-8"/>
+    <w:bookmarkEnd w:id="717"/>
+    <w:bookmarkStart w:id="718" w:name="n4-contraintes-8"/>
     <w:p>
       <w:pPr>
         <w:pStyle w:val="BodyText"/>
@@ -32994,8 +33294,8 @@
         <w:t xml:space="preserve">CT-07, dureté négociable : Équipe projet mobilisée aux sept dixièmes de son temps seulement.</w:t>
       </w:r>
     </w:p>
-    <w:bookmarkEnd w:id="708"/>
-    <w:bookmarkStart w:id="709" w:name="n4-contraintes-9"/>
+    <w:bookmarkEnd w:id="718"/>
+    <w:bookmarkStart w:id="719" w:name="n4-contraintes-9"/>
     <w:p>
       <w:pPr>
         <w:pStyle w:val="BodyText"/>
@@ -33012,8 +33312,8 @@
         <w:t xml:space="preserve">CT-08, dureté négociable : Interculturel : le siège valide le budget et les choix d’outils, les documents de pilotage du groupe sont en anglais, la filiale travaille en arabe, en darija et en français.</w:t>
       </w:r>
     </w:p>
-    <w:bookmarkEnd w:id="709"/>
-    <w:bookmarkStart w:id="710" w:name="n4-contraintes-10"/>
+    <w:bookmarkEnd w:id="719"/>
+    <w:bookmarkStart w:id="720" w:name="n4-contraintes-10"/>
     <w:p>
       <w:pPr>
         <w:pStyle w:val="BodyText"/>
@@ -33030,8 +33330,8 @@
         <w:t xml:space="preserve">CT-09, dureté négociable : Un précédent outil d’évaluation, introduit avant le rachat, a laissé de la méfiance dans les équipes.</w:t>
       </w:r>
     </w:p>
-    <w:bookmarkEnd w:id="710"/>
-    <w:bookmarkStart w:id="711" w:name="n4-contraintes-11"/>
+    <w:bookmarkEnd w:id="720"/>
+    <w:bookmarkStart w:id="721" w:name="n4-contraintes-11"/>
     <w:p>
       <w:pPr>
         <w:pStyle w:val="BodyText"/>
@@ -33048,8 +33348,8 @@
         <w:t xml:space="preserve">CT-10, dureté négociable : Les représentants du personnel attendent d’être informés de toute démarche touchant aux personnes.</w:t>
       </w:r>
     </w:p>
-    <w:bookmarkEnd w:id="711"/>
-    <w:bookmarkStart w:id="712" w:name="n4-contraintes-12"/>
+    <w:bookmarkEnd w:id="721"/>
+    <w:bookmarkStart w:id="722" w:name="n4-contraintes-12"/>
     <w:p>
       <w:pPr>
         <w:pStyle w:val="BodyText"/>
@@ -33098,8 +33398,8 @@
         <w:t xml:space="preserve">Faire confirmer par le commanditaire la dureté de chaque contrainte et son échéance.</w:t>
       </w:r>
     </w:p>
-    <w:bookmarkEnd w:id="712"/>
-    <w:bookmarkStart w:id="713" w:name="n4-contraintes-13"/>
+    <w:bookmarkEnd w:id="722"/>
+    <w:bookmarkStart w:id="723" w:name="n4-contraintes-13"/>
     <w:p>
       <w:pPr>
         <w:pStyle w:val="FirstParagraph"/>
@@ -33148,8 +33448,8 @@
         <w:t xml:space="preserve">Faire vérifier par Tenga Conseil l’état de la déclaration auprès de la CNDP et le cadre du transfert avant toute diffusion.</w:t>
       </w:r>
     </w:p>
-    <w:bookmarkEnd w:id="713"/>
-    <w:bookmarkStart w:id="714" w:name="n4-contraintes-14"/>
+    <w:bookmarkEnd w:id="723"/>
+    <w:bookmarkStart w:id="724" w:name="n4-contraintes-14"/>
     <w:p>
       <w:pPr>
         <w:pStyle w:val="FirstParagraph"/>
@@ -33198,9 +33498,9 @@
         <w:t xml:space="preserve">Faire confirmer par le commanditaire ce qui est réellement négociable, avec qui, et dans quel délai.</w:t>
       </w:r>
     </w:p>
-    <w:bookmarkEnd w:id="714"/>
-    <w:bookmarkEnd w:id="715"/>
-    <w:bookmarkStart w:id="728" w:name="n4-interculturel"/>
+    <w:bookmarkEnd w:id="724"/>
+    <w:bookmarkEnd w:id="725"/>
+    <w:bookmarkStart w:id="738" w:name="n4-interculturel"/>
     <w:p>
       <w:pPr>
         <w:pStyle w:val="Heading3"/>
@@ -33209,7 +33509,7 @@
         <w:t xml:space="preserve">Volet interculturel : organisation et sites</w:t>
       </w:r>
     </w:p>
-    <w:bookmarkStart w:id="716" w:name="n4-interculturel-1"/>
+    <w:bookmarkStart w:id="726" w:name="n4-interculturel-1"/>
     <w:p>
       <w:pPr>
         <w:pStyle w:val="FirstParagraph"/>
@@ -33226,8 +33526,8 @@
         <w:t xml:space="preserve">Ce volet est lu au niveau de l’organisation et de ses sites seulement : aucune tendance de pays n’est appliquée à une personne, et rien dans ce volet ne décrit un individu.</w:t>
       </w:r>
     </w:p>
-    <w:bookmarkEnd w:id="716"/>
-    <w:bookmarkStart w:id="717" w:name="n4-interculturel-2"/>
+    <w:bookmarkEnd w:id="726"/>
+    <w:bookmarkStart w:id="727" w:name="n4-interculturel-2"/>
     <w:p>
       <w:pPr>
         <w:pStyle w:val="BodyText"/>
@@ -33244,8 +33544,8 @@
         <w:t xml:space="preserve">Sites en présence : Casablanca (filiale), Paris (siège du groupe fictif) et Dubaï (centre de services partagés fictif). Langues de travail : arabe, darija, français et anglais. Fuseaux horaires concernés : Casablanca, Paris et Dubaï.</w:t>
       </w:r>
     </w:p>
-    <w:bookmarkEnd w:id="717"/>
-    <w:bookmarkStart w:id="718" w:name="n4-interculturel-3"/>
+    <w:bookmarkEnd w:id="727"/>
+    <w:bookmarkStart w:id="728" w:name="n4-interculturel-3"/>
     <w:p>
       <w:pPr>
         <w:pStyle w:val="BodyText"/>
@@ -33262,8 +33562,8 @@
         <w:t xml:space="preserve">Autonomie encadrée : le siège valide le budget et les choix d’outils, la filiale conduit l’exécution. Deux postes de direction sur sept occupés par des expatriés du groupe. Équipe projet répartie entre Casablanca et Dubaï, avec un point hebdomadaire avec Paris.</w:t>
       </w:r>
     </w:p>
-    <w:bookmarkEnd w:id="718"/>
-    <w:bookmarkStart w:id="719" w:name="n4-interculturel-4"/>
+    <w:bookmarkEnd w:id="728"/>
+    <w:bookmarkStart w:id="729" w:name="n4-interculturel-4"/>
     <w:p>
       <w:pPr>
         <w:pStyle w:val="BodyText"/>
@@ -33280,8 +33580,8 @@
         <w:t xml:space="preserve">Culture d’organisation de la maison mère : marché ; de la filiale : clan ; culture dominante saisie pour l’organisation : hiérarchie (quadrants de Cameron et Quinn). Ce sont des cultures d’entités, jamais des traits attribués à une personne.</w:t>
       </w:r>
     </w:p>
-    <w:bookmarkEnd w:id="719"/>
-    <w:bookmarkStart w:id="720" w:name="n4-interculturel-5"/>
+    <w:bookmarkEnd w:id="729"/>
+    <w:bookmarkStart w:id="730" w:name="n4-interculturel-5"/>
     <w:p>
       <w:pPr>
         <w:pStyle w:val="BodyText"/>
@@ -33330,8 +33630,8 @@
         <w:t xml:space="preserve">Demander à chaque site comment une décision se prend chez lui, et combien de temps prend une validation du siège.</w:t>
       </w:r>
     </w:p>
-    <w:bookmarkEnd w:id="720"/>
-    <w:bookmarkStart w:id="721" w:name="n4-interculturel-6"/>
+    <w:bookmarkEnd w:id="730"/>
+    <w:bookmarkStart w:id="731" w:name="n4-interculturel-6"/>
     <w:p>
       <w:pPr>
         <w:pStyle w:val="FirstParagraph"/>
@@ -33380,8 +33680,8 @@
         <w:t xml:space="preserve">Demander dans quelle langue se prennent les décisions, s’écrivent les documents et se tiennent les échanges informels, et ce qui se perd à chaque passage d’une langue à l’autre.</w:t>
       </w:r>
     </w:p>
-    <w:bookmarkEnd w:id="721"/>
-    <w:bookmarkStart w:id="722" w:name="n4-interculturel-7"/>
+    <w:bookmarkEnd w:id="731"/>
+    <w:bookmarkStart w:id="732" w:name="n4-interculturel-7"/>
     <w:p>
       <w:pPr>
         <w:pStyle w:val="FirstParagraph"/>
@@ -33430,8 +33730,8 @@
         <w:t xml:space="preserve">Demander quelles réunions tombent hors des heures de travail d’un site, et ce qui est décidé par écrit.</w:t>
       </w:r>
     </w:p>
-    <w:bookmarkEnd w:id="722"/>
-    <w:bookmarkStart w:id="723" w:name="n4-interculturel-8"/>
+    <w:bookmarkEnd w:id="732"/>
+    <w:bookmarkStart w:id="733" w:name="n4-interculturel-8"/>
     <w:p>
       <w:pPr>
         <w:pStyle w:val="FirstParagraph"/>
@@ -33480,8 +33780,8 @@
         <w:t xml:space="preserve">Demander à l’équipe de direction quelles habitudes de travail du siège et de la filiale se contredisent, et comment elles sont arbitrées.</w:t>
       </w:r>
     </w:p>
-    <w:bookmarkEnd w:id="723"/>
-    <w:bookmarkStart w:id="724" w:name="n4-interculturel-9"/>
+    <w:bookmarkEnd w:id="733"/>
+    <w:bookmarkStart w:id="734" w:name="n4-interculturel-9"/>
     <w:p>
       <w:pPr>
         <w:pStyle w:val="FirstParagraph"/>
@@ -33530,8 +33830,8 @@
         <w:t xml:space="preserve">Demander, pour trois décisions récentes, quelle logique (siège, filiale, métier) a finalement prévalu et pourquoi.</w:t>
       </w:r>
     </w:p>
-    <w:bookmarkEnd w:id="724"/>
-    <w:bookmarkStart w:id="725" w:name="n4-interculturel-10"/>
+    <w:bookmarkEnd w:id="734"/>
+    <w:bookmarkStart w:id="735" w:name="n4-interculturel-10"/>
     <w:p>
       <w:pPr>
         <w:pStyle w:val="FirstParagraph"/>
@@ -33548,8 +33848,8 @@
         <w:t xml:space="preserve">Piège 1, les grilles culturelles nationales : celles de Hofstede, de l’étude GLOBE (House et al.), de Meyer (carte culturelle) et de Hall (contexte élevé ou faible) décrivent des tendances de pays, non des personnes. Les appliquer à un individu est une erreur de raisonnement (erreur écologique). À l’usage, elles ne servent qu’à lire les règles du jeu d’une organisation et les frottements entre ses sites.</w:t>
       </w:r>
     </w:p>
-    <w:bookmarkEnd w:id="725"/>
-    <w:bookmarkStart w:id="726" w:name="n4-interculturel-11"/>
+    <w:bookmarkEnd w:id="735"/>
+    <w:bookmarkStart w:id="736" w:name="n4-interculturel-11"/>
     <w:p>
       <w:pPr>
         <w:pStyle w:val="BodyText"/>
@@ -33566,8 +33866,8 @@
         <w:t xml:space="preserve">Piège 2, les styles de réponse : la façon de répondre à un questionnaire (tendance à acquiescer, à éviter les extrêmes) peut varier selon la langue de passation. Tant que l’équivalence des versions n’est pas établie, comparer des personnes ayant répondu dans des langues différentes demande de la prudence, et la langue de passation est indiquée à côté de toute comparaison. Dans ce cas, les langues de passation sont français et arabe.</w:t>
       </w:r>
     </w:p>
-    <w:bookmarkEnd w:id="726"/>
-    <w:bookmarkStart w:id="727" w:name="n4-interculturel-12"/>
+    <w:bookmarkEnd w:id="736"/>
+    <w:bookmarkStart w:id="737" w:name="n4-interculturel-12"/>
     <w:p>
       <w:pPr>
         <w:pStyle w:val="BodyText"/>
@@ -33584,9 +33884,9 @@
         <w:t xml:space="preserve">Piège 3, la coexistence des cultures : dans un groupe, la culture de la maison mère, celle de la filiale et celle des métiers coexistent. Toute lecture doit dire laquelle s’applique à la situation étudiée (par exemple une équipe projet répartie entre plusieurs sites), faute de quoi elle mélange des règles du jeu différentes.</w:t>
       </w:r>
     </w:p>
-    <w:bookmarkEnd w:id="727"/>
-    <w:bookmarkEnd w:id="728"/>
-    <w:bookmarkStart w:id="733" w:name="n4-implications"/>
+    <w:bookmarkEnd w:id="737"/>
+    <w:bookmarkEnd w:id="738"/>
+    <w:bookmarkStart w:id="743" w:name="n4-implications"/>
     <w:p>
       <w:pPr>
         <w:pStyle w:val="Heading3"/>
@@ -33595,7 +33895,7 @@
         <w:t xml:space="preserve">Implications pour la structure, les rôles, les rituels et le pilotage</w:t>
       </w:r>
     </w:p>
-    <w:bookmarkStart w:id="729" w:name="n4-implications-1"/>
+    <w:bookmarkStart w:id="739" w:name="n4-implications-1"/>
     <w:p>
       <w:pPr>
         <w:pStyle w:val="FirstParagraph"/>
@@ -33644,8 +33944,8 @@
         <w:t xml:space="preserve">Demander au commanditaire quelles décisions du projet peuvent être prises sans passer par la ligne ordinaire, et lesquelles non.</w:t>
       </w:r>
     </w:p>
-    <w:bookmarkEnd w:id="729"/>
-    <w:bookmarkStart w:id="730" w:name="n4-implications-2"/>
+    <w:bookmarkEnd w:id="739"/>
+    <w:bookmarkStart w:id="740" w:name="n4-implications-2"/>
     <w:p>
       <w:pPr>
         <w:pStyle w:val="FirstParagraph"/>
@@ -33694,8 +33994,8 @@
         <w:t xml:space="preserve">Demander à chaque rôle ce qui s’arrêterait s’il était absent deux semaines, et qui prendrait le relais.</w:t>
       </w:r>
     </w:p>
-    <w:bookmarkEnd w:id="730"/>
-    <w:bookmarkStart w:id="731" w:name="n4-implications-3"/>
+    <w:bookmarkEnd w:id="740"/>
+    <w:bookmarkStart w:id="741" w:name="n4-implications-3"/>
     <w:p>
       <w:pPr>
         <w:pStyle w:val="FirstParagraph"/>
@@ -33744,8 +34044,8 @@
         <w:t xml:space="preserve">Demander quels rituels existent aujourd’hui, lesquels sont jugés utiles par les participants et lesquels sont subis.</w:t>
       </w:r>
     </w:p>
-    <w:bookmarkEnd w:id="731"/>
-    <w:bookmarkStart w:id="732" w:name="n4-implications-4"/>
+    <w:bookmarkEnd w:id="741"/>
+    <w:bookmarkStart w:id="742" w:name="n4-implications-4"/>
     <w:p>
       <w:pPr>
         <w:pStyle w:val="FirstParagraph"/>
@@ -33794,9 +34094,9 @@
         <w:t xml:space="preserve">Demander au commanditaire quels indicateurs il suit réellement, à quelle fréquence, et lesquels déclenchent une décision.</w:t>
       </w:r>
     </w:p>
-    <w:bookmarkEnd w:id="732"/>
-    <w:bookmarkEnd w:id="733"/>
-    <w:bookmarkStart w:id="739" w:name="recommandations-3"/>
+    <w:bookmarkEnd w:id="742"/>
+    <w:bookmarkEnd w:id="743"/>
+    <w:bookmarkStart w:id="749" w:name="recommandations-3"/>
     <w:p>
       <w:pPr>
         <w:pStyle w:val="Heading3"/>
@@ -33805,7 +34105,7 @@
         <w:t xml:space="preserve">Recommandations</w:t>
       </w:r>
     </w:p>
-    <w:bookmarkStart w:id="734" w:name="X837cedbb93a058b853e0fbfb51b31e10729b69d"/>
+    <w:bookmarkStart w:id="744" w:name="X837cedbb93a058b853e0fbfb51b31e10729b69d"/>
     <w:p>
       <w:pPr>
         <w:pStyle w:val="Heading4"/>
@@ -33926,8 +34226,8 @@
         <w:t xml:space="preserve">Contrôle bloquant avant chaque génération de rapport (effectif au moins égal à 5, ou cas fictif consenti) ; nombre d’agrégats produits sous le seuil pour des cas réels, relevé à chaque génération (cible : aucun).</w:t>
       </w:r>
     </w:p>
-    <w:bookmarkEnd w:id="734"/>
-    <w:bookmarkStart w:id="735" w:name="Xdbefff8ed5ff0c1fdd3fbc53847b30e6e4ff68b"/>
+    <w:bookmarkEnd w:id="744"/>
+    <w:bookmarkStart w:id="745" w:name="Xdbefff8ed5ff0c1fdd3fbc53847b30e6e4ff68b"/>
     <w:p>
       <w:pPr>
         <w:pStyle w:val="Heading4"/>
@@ -34048,8 +34348,8 @@
         <w:t xml:space="preserve">Statut de chaque formalité (faite, en cours, à faire), relevé à 30 jours puis avant le dépôt du dossier à la CNDP.</w:t>
       </w:r>
     </w:p>
-    <w:bookmarkEnd w:id="735"/>
-    <w:bookmarkStart w:id="736" w:name="X9a10b0b01aaf7e2fdfa42fcf0aaacc4594c5790"/>
+    <w:bookmarkEnd w:id="745"/>
+    <w:bookmarkStart w:id="746" w:name="X9a10b0b01aaf7e2fdfa42fcf0aaacc4594c5790"/>
     <w:p>
       <w:pPr>
         <w:pStyle w:val="Heading4"/>
@@ -34170,8 +34470,8 @@
         <w:t xml:space="preserve">Délai moyen de décision entre la filiale et le siège, relevé à 60 puis 90 jours.</w:t>
       </w:r>
     </w:p>
-    <w:bookmarkEnd w:id="736"/>
-    <w:bookmarkStart w:id="737" w:name="X9780645f6ce8e27bffeda6cee41816ecd0973d9"/>
+    <w:bookmarkEnd w:id="746"/>
+    <w:bookmarkStart w:id="747" w:name="X9780645f6ce8e27bffeda6cee41816ecd0973d9"/>
     <w:p>
       <w:pPr>
         <w:pStyle w:val="Heading4"/>
@@ -34309,8 +34609,8 @@
         <w:t xml:space="preserve">Nombre de propositions examinées et part de celles qui reçoivent une réponse dans le délai convenu, relevés à 60 puis 90 jours.</w:t>
       </w:r>
     </w:p>
-    <w:bookmarkEnd w:id="737"/>
-    <w:bookmarkStart w:id="738" w:name="Xed65feccf06c1cdcb6c42196ada2964bf2a52a6"/>
+    <w:bookmarkEnd w:id="747"/>
+    <w:bookmarkStart w:id="748" w:name="Xed65feccf06c1cdcb6c42196ada2964bf2a52a6"/>
     <w:p>
       <w:pPr>
         <w:pStyle w:val="Heading4"/>
@@ -34431,12 +34731,12 @@
         <w:t xml:space="preserve">Taux de participation aux rituels d’équipe du projet, relevé à 30 puis 90 jours, et questions des représentants du personnel restées sans réponse.</w:t>
       </w:r>
     </w:p>
-    <w:bookmarkEnd w:id="738"/>
-    <w:bookmarkEnd w:id="739"/>
-    <w:bookmarkEnd w:id="740"/>
-    <w:bookmarkEnd w:id="741"/>
-    <w:bookmarkStart w:id="801" w:name="n5-accompagnement"/>
-    <w:bookmarkStart w:id="800" w:name="plan-daccompagnement-intégré"/>
+    <w:bookmarkEnd w:id="748"/>
+    <w:bookmarkEnd w:id="749"/>
+    <w:bookmarkEnd w:id="750"/>
+    <w:bookmarkEnd w:id="751"/>
+    <w:bookmarkStart w:id="811" w:name="n5-accompagnement"/>
+    <w:bookmarkStart w:id="810" w:name="plan-daccompagnement-intégré"/>
     <w:p>
       <w:pPr>
         <w:pStyle w:val="Heading2"/>
@@ -34445,7 +34745,7 @@
         <w:t xml:space="preserve">Plan d’accompagnement intégré</w:t>
       </w:r>
     </w:p>
-    <w:bookmarkStart w:id="748" w:name="depart"/>
+    <w:bookmarkStart w:id="758" w:name="depart"/>
     <w:p>
       <w:pPr>
         <w:pStyle w:val="Heading3"/>
@@ -34454,7 +34754,7 @@
         <w:t xml:space="preserve">Point de départ : les faits qui fondent le plan</w:t>
       </w:r>
     </w:p>
-    <w:bookmarkStart w:id="742" w:name="n5-depart-1"/>
+    <w:bookmarkStart w:id="752" w:name="n5-depart-1"/>
     <w:p>
       <w:pPr>
         <w:pStyle w:val="FirstParagraph"/>
@@ -34471,8 +34771,8 @@
         <w:t xml:space="preserve">Le plan d’accompagnement est tiré des seuls faits calculés par le moteur et des contraintes saisies pour Démo Distribution Maroc (fictif) : 4 personnes, 6 relations, orientation de croissance, tâche de nature projet. Aucune référence à un groupe externe n’est utilisée et rien n’y est conclu sur la valeur des personnes.</w:t>
       </w:r>
     </w:p>
-    <w:bookmarkEnd w:id="742"/>
-    <w:bookmarkStart w:id="743" w:name="n5-depart-2"/>
+    <w:bookmarkEnd w:id="752"/>
+    <w:bookmarkStart w:id="753" w:name="n5-depart-2"/>
     <w:p>
       <w:pPr>
         <w:pStyle w:val="BodyText"/>
@@ -34489,8 +34789,8 @@
         <w:t xml:space="preserve">Tension interne la plus nette : C1 (Confiance déclarée dans sa maîtrise des tâches) et C6 (Réflexion avant d’agir) pour AM, écart de 3 points sur l’échelle de 1 à 5 (valeurs de 5 et de 2). Une tension d’un autre domaine, d’écart 2 points, porte sur E2 (Goût de la compagnie et des foules) et E3 (Affirmation de soi) pour AM.</w:t>
       </w:r>
     </w:p>
-    <w:bookmarkEnd w:id="743"/>
-    <w:bookmarkStart w:id="744" w:name="n5-depart-3"/>
+    <w:bookmarkEnd w:id="753"/>
+    <w:bookmarkStart w:id="754" w:name="n5-depart-3"/>
     <w:p>
       <w:pPr>
         <w:pStyle w:val="BodyText"/>
@@ -34507,8 +34807,8 @@
         <w:t xml:space="preserve">Écarts de facette les plus notables entre deux personnes : O5 (Curiosité intellectuelle) dans AM-KB (3 points), E3 (Affirmation de soi) dans AM-HT (3 points) et E5 (Goût de l’aventure et du risque) dans SR-HT (2,75 points). Ces écarts décrivent des façons de travailler différentes sur la tâche, sans désigner de référence.</w:t>
       </w:r>
     </w:p>
-    <w:bookmarkEnd w:id="744"/>
-    <w:bookmarkStart w:id="745" w:name="n5-depart-4"/>
+    <w:bookmarkEnd w:id="754"/>
+    <w:bookmarkStart w:id="755" w:name="n5-depart-4"/>
     <w:p>
       <w:pPr>
         <w:pStyle w:val="BodyText"/>
@@ -34525,8 +34825,8 @@
         <w:t xml:space="preserve">Diversité d’équipe : les cinq domaines ont une dispersion diverse ; les étendues de facette les plus larges sont celles de E3 (Affirmation de soi) et de O5 (Curiosité intellectuelle), de 3 points chacune.</w:t>
       </w:r>
     </w:p>
-    <w:bookmarkEnd w:id="745"/>
-    <w:bookmarkStart w:id="746" w:name="n5-depart-5"/>
+    <w:bookmarkEnd w:id="755"/>
+    <w:bookmarkStart w:id="756" w:name="n5-depart-5"/>
     <w:p>
       <w:pPr>
         <w:pStyle w:val="BodyText"/>
@@ -34543,8 +34843,8 @@
         <w:t xml:space="preserve">Adéquation organisationnelle (effectif de 4 personnes pour un seuil d’anonymat de 5 : agrégat montré par dérogation de démonstration) : valeurs d’équipe pour Extraversion à 3,48 (plutôt haut), Ouverture à 3,64 (plutôt haut) et Conscienciosité à 3,8 (plutôt haut), selon les conventions de l’outil. Ces valeurs se lisent avec la structure (bureaucratie mécaniste), la culture dominante (hiérarchie) et l’orientation de croissance ; leur effet sur le travail de l’équipe est à instruire en entretien, et les dispositifs d’organisation du plan en tiennent compte.</w:t>
       </w:r>
     </w:p>
-    <w:bookmarkEnd w:id="746"/>
-    <w:bookmarkStart w:id="747" w:name="n5-depart-6"/>
+    <w:bookmarkEnd w:id="756"/>
+    <w:bookmarkStart w:id="757" w:name="n5-depart-6"/>
     <w:p>
       <w:pPr>
         <w:pStyle w:val="BodyText"/>
@@ -34561,9 +34861,9 @@
         <w:t xml:space="preserve">Contraintes dures du cas, que le plan respecte sans les négocier : CT-01 (réglementation), CT-02 (réglementation), CT-03 (réglementation), CT-04 (réglementation) et CT-05 (délai). En conséquence, toute action fondée sur une lecture de relation ou d’équipe est conditionnée, dans le calendrier lui-même, à l’autorisation de la CNDP (CT-02) ; seules les actions individuelles consenties et privées, ou fondées sur les seules données du cas, démarrent avant. La marge de manœuvre se cherche dans les contraintes négociables (CT-06, CT-07, CT-08, CT-09 et CT-10).</w:t>
       </w:r>
     </w:p>
-    <w:bookmarkEnd w:id="747"/>
-    <w:bookmarkEnd w:id="748"/>
-    <w:bookmarkStart w:id="752" w:name="coaching"/>
+    <w:bookmarkEnd w:id="757"/>
+    <w:bookmarkEnd w:id="758"/>
+    <w:bookmarkStart w:id="762" w:name="coaching"/>
     <w:p>
       <w:pPr>
         <w:pStyle w:val="Heading3"/>
@@ -34572,7 +34872,7 @@
         <w:t xml:space="preserve">Coaching individuel et d’équipe</w:t>
       </w:r>
     </w:p>
-    <w:bookmarkStart w:id="749" w:name="n5-coaching-1"/>
+    <w:bookmarkStart w:id="759" w:name="n5-coaching-1"/>
     <w:p>
       <w:pPr>
         <w:pStyle w:val="FirstParagraph"/>
@@ -34621,8 +34921,8 @@
         <w:t xml:space="preserve">Demander à AM, en entretien, une situation récente du projet où ces deux facettes ont tiré dans des sens opposés, et ce qui en est résulté.</w:t>
       </w:r>
     </w:p>
-    <w:bookmarkEnd w:id="749"/>
-    <w:bookmarkStart w:id="750" w:name="n5-coaching-2"/>
+    <w:bookmarkEnd w:id="759"/>
+    <w:bookmarkStart w:id="760" w:name="n5-coaching-2"/>
     <w:p>
       <w:pPr>
         <w:pStyle w:val="FirstParagraph"/>
@@ -34671,8 +34971,8 @@
         <w:t xml:space="preserve">Faire décrire à chacune des deux personnes, séparément, trois décisions récentes du binôme et la façon dont elles ont été prises ; comparer les deux récits.</w:t>
       </w:r>
     </w:p>
-    <w:bookmarkEnd w:id="750"/>
-    <w:bookmarkStart w:id="751" w:name="n5-coaching-3"/>
+    <w:bookmarkEnd w:id="760"/>
+    <w:bookmarkStart w:id="761" w:name="n5-coaching-3"/>
     <w:p>
       <w:pPr>
         <w:pStyle w:val="FirstParagraph"/>
@@ -34721,9 +35021,9 @@
         <w:t xml:space="preserve">Demander à chaque membre, avant l’atelier, deux situations du projet où la différence de style de travail a aidé et deux où elle a gêné ; confronter les réponses.</w:t>
       </w:r>
     </w:p>
-    <w:bookmarkEnd w:id="751"/>
-    <w:bookmarkEnd w:id="752"/>
-    <w:bookmarkStart w:id="755" w:name="mentorat"/>
+    <w:bookmarkEnd w:id="761"/>
+    <w:bookmarkEnd w:id="762"/>
+    <w:bookmarkStart w:id="765" w:name="mentorat"/>
     <w:p>
       <w:pPr>
         <w:pStyle w:val="Heading3"/>
@@ -34732,7 +35032,7 @@
         <w:t xml:space="preserve">Mentorat</w:t>
       </w:r>
     </w:p>
-    <w:bookmarkStart w:id="753" w:name="n5-mentorat-1"/>
+    <w:bookmarkStart w:id="763" w:name="n5-mentorat-1"/>
     <w:p>
       <w:pPr>
         <w:pStyle w:val="FirstParagraph"/>
@@ -34781,8 +35081,8 @@
         <w:t xml:space="preserve">Demander à la personne accompagnée trois sujets sur lesquels elle souhaite être accompagnée, avant de fixer le contenu de la charte.</w:t>
       </w:r>
     </w:p>
-    <w:bookmarkEnd w:id="753"/>
-    <w:bookmarkStart w:id="754" w:name="n5-mentorat-2"/>
+    <w:bookmarkEnd w:id="763"/>
+    <w:bookmarkStart w:id="764" w:name="n5-mentorat-2"/>
     <w:p>
       <w:pPr>
         <w:pStyle w:val="FirstParagraph"/>
@@ -34831,9 +35131,9 @@
         <w:t xml:space="preserve">Demander à chaque personne ce qu’elle attend de l’autre en amont ou en aval du travail, puis vérifier si ces attentes sont connues de l’autre.</w:t>
       </w:r>
     </w:p>
-    <w:bookmarkEnd w:id="754"/>
-    <w:bookmarkEnd w:id="755"/>
-    <w:bookmarkStart w:id="759" w:name="formation"/>
+    <w:bookmarkEnd w:id="764"/>
+    <w:bookmarkEnd w:id="765"/>
+    <w:bookmarkStart w:id="769" w:name="formation"/>
     <w:p>
       <w:pPr>
         <w:pStyle w:val="Heading3"/>
@@ -34842,7 +35142,7 @@
         <w:t xml:space="preserve">Formation aux savoir-faire comportementaux</w:t>
       </w:r>
     </w:p>
-    <w:bookmarkStart w:id="756" w:name="n5-formation-1"/>
+    <w:bookmarkStart w:id="766" w:name="n5-formation-1"/>
     <w:p>
       <w:pPr>
         <w:pStyle w:val="FirstParagraph"/>
@@ -34891,8 +35191,8 @@
         <w:t xml:space="preserve">Relever, avant la formation, trois demandes de décision récentes adressées au siège et le nombre d’échanges nécessaires pour obtenir la réponse.</w:t>
       </w:r>
     </w:p>
-    <w:bookmarkEnd w:id="756"/>
-    <w:bookmarkStart w:id="757" w:name="n5-formation-2"/>
+    <w:bookmarkEnd w:id="766"/>
+    <w:bookmarkStart w:id="767" w:name="n5-formation-2"/>
     <w:p>
       <w:pPr>
         <w:pStyle w:val="FirstParagraph"/>
@@ -34941,8 +35241,8 @@
         <w:t xml:space="preserve">Recueillir par questions ouvertes, auprès de chaque membre, ce qu’il pense pouvoir dire en réunion sans crainte ; comparer ces réponses avant et après la formation.</w:t>
       </w:r>
     </w:p>
-    <w:bookmarkEnd w:id="757"/>
-    <w:bookmarkStart w:id="758" w:name="n5-formation-3"/>
+    <w:bookmarkEnd w:id="767"/>
+    <w:bookmarkStart w:id="768" w:name="n5-formation-3"/>
     <w:p>
       <w:pPr>
         <w:pStyle w:val="FirstParagraph"/>
@@ -34991,9 +35291,9 @@
         <w:t xml:space="preserve">Demander à chaque membre comment il décide qu’un livrable est prêt, puis comparer ces critères entre les membres.</w:t>
       </w:r>
     </w:p>
-    <w:bookmarkEnd w:id="758"/>
-    <w:bookmarkEnd w:id="759"/>
-    <w:bookmarkStart w:id="764" w:name="organisation"/>
+    <w:bookmarkEnd w:id="768"/>
+    <w:bookmarkEnd w:id="769"/>
+    <w:bookmarkStart w:id="774" w:name="organisation"/>
     <w:p>
       <w:pPr>
         <w:pStyle w:val="Heading3"/>
@@ -35002,7 +35302,7 @@
         <w:t xml:space="preserve">Dispositifs d’organisation : rôles, règles de décision, rituels, responsabilités</w:t>
       </w:r>
     </w:p>
-    <w:bookmarkStart w:id="760" w:name="n5-organisation-1"/>
+    <w:bookmarkStart w:id="770" w:name="n5-organisation-1"/>
     <w:p>
       <w:pPr>
         <w:pStyle w:val="FirstParagraph"/>
@@ -35051,8 +35351,8 @@
         <w:t xml:space="preserve">Faire remplir la matrice séparément par chaque personne, puis relever les cases où les réponses divergent ; ces cases sont les sujets de la réunion de validation.</w:t>
       </w:r>
     </w:p>
-    <w:bookmarkEnd w:id="760"/>
-    <w:bookmarkStart w:id="761" w:name="n5-organisation-2"/>
+    <w:bookmarkEnd w:id="770"/>
+    <w:bookmarkStart w:id="771" w:name="n5-organisation-2"/>
     <w:p>
       <w:pPr>
         <w:pStyle w:val="FirstParagraph"/>
@@ -35101,8 +35401,8 @@
         <w:t xml:space="preserve">Relever, sur les décisions des derniers mois, le délai entre la demande et la réponse du siège, et les décisions remontées alors qu’elles auraient pu être prises localement.</w:t>
       </w:r>
     </w:p>
-    <w:bookmarkEnd w:id="761"/>
-    <w:bookmarkStart w:id="762" w:name="n5-organisation-3"/>
+    <w:bookmarkEnd w:id="771"/>
+    <w:bookmarkStart w:id="772" w:name="n5-organisation-3"/>
     <w:p>
       <w:pPr>
         <w:pStyle w:val="FirstParagraph"/>
@@ -35151,8 +35451,8 @@
         <w:t xml:space="preserve">Demander à chaque membre quels échanges lui font perdre du temps et lesquels débloquent le travail, avant de fixer le calendrier des rituels.</w:t>
       </w:r>
     </w:p>
-    <w:bookmarkEnd w:id="762"/>
-    <w:bookmarkStart w:id="763" w:name="n5-organisation-4"/>
+    <w:bookmarkEnd w:id="772"/>
+    <w:bookmarkStart w:id="773" w:name="n5-organisation-4"/>
     <w:p>
       <w:pPr>
         <w:pStyle w:val="FirstParagraph"/>
@@ -35201,9 +35501,9 @@
         <w:t xml:space="preserve">Demander aux représentants du personnel et à quelques membres de l’équipe ce qu’ils ont compris de l’usage des résultats ; corriger l’information tant que leurs réponses divergent.</w:t>
       </w:r>
     </w:p>
-    <w:bookmarkEnd w:id="763"/>
-    <w:bookmarkEnd w:id="764"/>
-    <w:bookmarkStart w:id="771" w:name="calendrier"/>
+    <w:bookmarkEnd w:id="773"/>
+    <w:bookmarkEnd w:id="774"/>
+    <w:bookmarkStart w:id="781" w:name="calendrier"/>
     <w:p>
       <w:pPr>
         <w:pStyle w:val="Heading3"/>
@@ -35212,7 +35512,7 @@
         <w:t xml:space="preserve">Calendrier en jalons à 30, 60 et 90 jours</w:t>
       </w:r>
     </w:p>
-    <w:bookmarkStart w:id="765" w:name="n5-calendrier-1"/>
+    <w:bookmarkStart w:id="775" w:name="n5-calendrier-1"/>
     <w:p>
       <w:pPr>
         <w:pStyle w:val="FirstParagraph"/>
@@ -35229,8 +35529,8 @@
         <w:t xml:space="preserve">Échéances du cas, reprises telles quelles : Dépôt du dossier CNDP : dans les 3 mois ; Pilote sur un seul site : dans les 6 mois ; Lancement : dans les 9 mois. Le plan se cale sur ces échéances et ne les modifie pas.</w:t>
       </w:r>
     </w:p>
-    <w:bookmarkEnd w:id="765"/>
-    <w:bookmarkStart w:id="766" w:name="n5-calendrier-2"/>
+    <w:bookmarkEnd w:id="775"/>
+    <w:bookmarkStart w:id="776" w:name="n5-calendrier-2"/>
     <w:p>
       <w:pPr>
         <w:pStyle w:val="BodyText"/>
@@ -35279,8 +35579,8 @@
         <w:t xml:space="preserve">Vérifier avec le pilote du programme que chaque action de ce jalon a un responsable nommé et une date, et qu’aucune ne dépend d’une autorisation non encore obtenue.</w:t>
       </w:r>
     </w:p>
-    <w:bookmarkEnd w:id="766"/>
-    <w:bookmarkStart w:id="767" w:name="n5-calendrier-3"/>
+    <w:bookmarkEnd w:id="776"/>
+    <w:bookmarkStart w:id="777" w:name="n5-calendrier-3"/>
     <w:p>
       <w:pPr>
         <w:pStyle w:val="FirstParagraph"/>
@@ -35329,8 +35629,8 @@
         <w:t xml:space="preserve">Vérifier en réunion de jalon que le siège a confirmé les règles de décision et que le temps de formation a pu être libéré malgré la mobilisation aux sept dixièmes.</w:t>
       </w:r>
     </w:p>
-    <w:bookmarkEnd w:id="767"/>
-    <w:bookmarkStart w:id="768" w:name="n5-calendrier-4"/>
+    <w:bookmarkEnd w:id="777"/>
+    <w:bookmarkStart w:id="778" w:name="n5-calendrier-4"/>
     <w:p>
       <w:pPr>
         <w:pStyle w:val="FirstParagraph"/>
@@ -35379,8 +35679,8 @@
         <w:t xml:space="preserve">Comparer, avec le commanditaire, les indicateurs du jalon à la référence de départ et recueillir le point de vue de chaque membre sur ce qui a changé dans le travail.</w:t>
       </w:r>
     </w:p>
-    <w:bookmarkEnd w:id="768"/>
-    <w:bookmarkStart w:id="769" w:name="n5-calendrier-5"/>
+    <w:bookmarkEnd w:id="778"/>
+    <w:bookmarkStart w:id="779" w:name="n5-calendrier-5"/>
     <w:p>
       <w:pPr>
         <w:pStyle w:val="FirstParagraph"/>
@@ -35429,8 +35729,8 @@
         <w:t xml:space="preserve">Demander à chaque responsable, à chaque jalon, le temps réellement consacré aux actions du plan et réaffecter une action si ce temps dépasse ce qui était prévu.</w:t>
       </w:r>
     </w:p>
-    <w:bookmarkEnd w:id="769"/>
-    <w:bookmarkStart w:id="770" w:name="n5-calendrier-6"/>
+    <w:bookmarkEnd w:id="779"/>
+    <w:bookmarkStart w:id="780" w:name="n5-calendrier-6"/>
     <w:p>
       <w:pPr>
         <w:pStyle w:val="FirstParagraph"/>
@@ -35479,9 +35779,9 @@
         <w:t xml:space="preserve">Demander à la personne chargée de la conformité des données un état d’avancement du dossier à chaque jalon.</w:t>
       </w:r>
     </w:p>
-    <w:bookmarkEnd w:id="770"/>
-    <w:bookmarkEnd w:id="771"/>
-    <w:bookmarkStart w:id="776" w:name="mesure"/>
+    <w:bookmarkEnd w:id="780"/>
+    <w:bookmarkEnd w:id="781"/>
+    <w:bookmarkStart w:id="786" w:name="mesure"/>
     <w:p>
       <w:pPr>
         <w:pStyle w:val="Heading3"/>
@@ -35490,7 +35790,7 @@
         <w:t xml:space="preserve">Indicateurs et mesure d’impact</w:t>
       </w:r>
     </w:p>
-    <w:bookmarkStart w:id="772" w:name="n5-mesure-1"/>
+    <w:bookmarkStart w:id="782" w:name="n5-mesure-1"/>
     <w:p>
       <w:pPr>
         <w:pStyle w:val="FirstParagraph"/>
@@ -35507,8 +35807,8 @@
         <w:t xml:space="preserve">Indicateurs de succès du cas : Respect du calendrier du lancement, Délai moyen de décision entre la filiale et le siège et Taux de participation aux rituels d’équipe du projet. Moments de mesure proposés : avant le démarrage (référence de départ), à 60 jours et à 90 jours ; source de la donnée : journal des décisions du programme, tableau de bord du lancement et feuilles de présence des rituels.</w:t>
       </w:r>
     </w:p>
-    <w:bookmarkEnd w:id="772"/>
-    <w:bookmarkStart w:id="773" w:name="n5-mesure-2"/>
+    <w:bookmarkEnd w:id="782"/>
+    <w:bookmarkStart w:id="783" w:name="n5-mesure-2"/>
     <w:p>
       <w:pPr>
         <w:pStyle w:val="BodyText"/>
@@ -35557,8 +35857,8 @@
         <w:t xml:space="preserve">Faire valider par le commanditaire la définition de chaque indicateur et la source de la donnée avant la mesure de départ.</w:t>
       </w:r>
     </w:p>
-    <w:bookmarkEnd w:id="773"/>
-    <w:bookmarkStart w:id="774" w:name="n5-mesure-3"/>
+    <w:bookmarkEnd w:id="783"/>
+    <w:bookmarkStart w:id="784" w:name="n5-mesure-3"/>
     <w:p>
       <w:pPr>
         <w:pStyle w:val="FirstParagraph"/>
@@ -35607,8 +35907,8 @@
         <w:t xml:space="preserve">Faire confirmer par le concepteur de chaque formation la forme de l’exercice du niveau 2 et le moment où les niveaux 3 et 4 seront mesurés après le plan.</w:t>
       </w:r>
     </w:p>
-    <w:bookmarkEnd w:id="774"/>
-    <w:bookmarkStart w:id="775" w:name="n5-mesure-4"/>
+    <w:bookmarkEnd w:id="784"/>
+    <w:bookmarkStart w:id="785" w:name="n5-mesure-4"/>
     <w:p>
       <w:pPr>
         <w:pStyle w:val="FirstParagraph"/>
@@ -35657,9 +35957,9 @@
         <w:t xml:space="preserve">Tester les trois questions auprès de deux personnes avant leur diffusion pour vérifier qu’elles sont comprises de la même façon.</w:t>
       </w:r>
     </w:p>
-    <w:bookmarkEnd w:id="775"/>
-    <w:bookmarkEnd w:id="776"/>
-    <w:bookmarkStart w:id="783" w:name="garde-fous"/>
+    <w:bookmarkEnd w:id="785"/>
+    <w:bookmarkEnd w:id="786"/>
+    <w:bookmarkStart w:id="793" w:name="garde-fous"/>
     <w:p>
       <w:pPr>
         <w:pStyle w:val="Heading3"/>
@@ -35668,7 +35968,7 @@
         <w:t xml:space="preserve">Conditions et garde-fous</w:t>
       </w:r>
     </w:p>
-    <w:bookmarkStart w:id="777" w:name="n5-garde-fous-1"/>
+    <w:bookmarkStart w:id="787" w:name="n5-garde-fous-1"/>
     <w:p>
       <w:pPr>
         <w:pStyle w:val="FirstParagraph"/>
@@ -35685,8 +35985,8 @@
         <w:t xml:space="preserve">Aucune décision d’emploi (recrutement, promotion, licenciement, affectation) ne peut s’appuyer sur ces rapports. Il s’agit d’une règle posée par l’outil ; son articulation avec le Code du travail (loi 65-99, CT-03) est à instruire par Tenga Conseil. Elle vaut pour le plan comme pour les lectures qui le fondent.</w:t>
       </w:r>
     </w:p>
-    <w:bookmarkEnd w:id="777"/>
-    <w:bookmarkStart w:id="778" w:name="n5-garde-fous-2"/>
+    <w:bookmarkEnd w:id="787"/>
+    <w:bookmarkStart w:id="788" w:name="n5-garde-fous-2"/>
     <w:p>
       <w:pPr>
         <w:pStyle w:val="BodyText"/>
@@ -35703,8 +36003,8 @@
         <w:t xml:space="preserve">Consentement : les résultats du questionnaire sont des données personnelles (loi 09-08, CT-01). Information et consentement préalables des personnes, consentement distinct pour chaque niveau de rapport (individuel, binôme, équipe, organisation), retrait possible à tout moment ; aucune donnée n’est exploitée sans consentement tracé.</w:t>
       </w:r>
     </w:p>
-    <w:bookmarkEnd w:id="778"/>
-    <w:bookmarkStart w:id="779" w:name="n5-garde-fous-3"/>
+    <w:bookmarkEnd w:id="788"/>
+    <w:bookmarkStart w:id="789" w:name="n5-garde-fous-3"/>
     <w:p>
       <w:pPr>
         <w:pStyle w:val="BodyText"/>
@@ -35721,8 +36021,8 @@
         <w:t xml:space="preserve">Base juridique à faire instruire par Tenga Conseil avant tout usage : déclaration ou autorisation préalable du traitement auprès de la CNDP avant toute analyse de relation ou d’équipe (CT-02) ; cadre et autorisation d’un transfert de données vers le siège à l’étranger (CT-04) ; Code du travail (loi 65-99). Le RGPD et le règlement 2024/1689 ne s’appliquent que si l’organisation y est soumise, ce qui est à instruire ; la règle de prudence retenue est d’appliquer l’exigence la plus forte. Ces éléments sont des faits de cadre, non un avis juridique.</w:t>
       </w:r>
     </w:p>
-    <w:bookmarkEnd w:id="779"/>
-    <w:bookmarkStart w:id="780" w:name="n5-garde-fous-4"/>
+    <w:bookmarkEnd w:id="789"/>
+    <w:bookmarkStart w:id="790" w:name="n5-garde-fous-4"/>
     <w:p>
       <w:pPr>
         <w:pStyle w:val="BodyText"/>
@@ -35739,8 +36039,8 @@
         <w:t xml:space="preserve">Relecture et signature : un consultant qualifié désigné par Tenga Conseil relit et signe le plan avant toute remise. L’outil prépare et argumente, il ne conclut pas. La norme ISO 10667 (prestation d’évaluation en contexte de travail) est citée comme pratique visée, sans certification revendiquée.</w:t>
       </w:r>
     </w:p>
-    <w:bookmarkEnd w:id="780"/>
-    <w:bookmarkStart w:id="781" w:name="n5-garde-fous-5"/>
+    <w:bookmarkEnd w:id="790"/>
+    <w:bookmarkStart w:id="791" w:name="n5-garde-fous-5"/>
     <w:p>
       <w:pPr>
         <w:pStyle w:val="BodyText"/>
@@ -35757,8 +36057,8 @@
         <w:t xml:space="preserve">Seuil d’anonymat : l’équipe compte 4 personnes pour un seuil de 5 non atteint ; l’agrégat n’est montré que par dérogation de démonstration, parce que le cas est fictif et consenti. Cette dérogation ne s’applique à aucune organisation réelle.</w:t>
       </w:r>
     </w:p>
-    <w:bookmarkEnd w:id="781"/>
-    <w:bookmarkStart w:id="782" w:name="n5-garde-fous-6"/>
+    <w:bookmarkEnd w:id="791"/>
+    <w:bookmarkStart w:id="792" w:name="n5-garde-fous-6"/>
     <w:p>
       <w:pPr>
         <w:pStyle w:val="BodyText"/>
@@ -35775,9 +36075,9 @@
         <w:t xml:space="preserve">Information des représentants du personnel (CT-10) et transparence sur l’usage des résultats (CT-09) avant toute diffusion. Les niveaux « bas » à « haut » sont des conventions de l’outil, non calibrées : le plan compare des personnes entre elles et chacune à sa propre échelle, jamais à un groupe de référence.</w:t>
       </w:r>
     </w:p>
-    <w:bookmarkEnd w:id="782"/>
-    <w:bookmarkEnd w:id="783"/>
-    <w:bookmarkStart w:id="799" w:name="recommandations-4"/>
+    <w:bookmarkEnd w:id="792"/>
+    <w:bookmarkEnd w:id="793"/>
+    <w:bookmarkStart w:id="809" w:name="recommandations-4"/>
     <w:p>
       <w:pPr>
         <w:pStyle w:val="Heading3"/>
@@ -35786,7 +36086,7 @@
         <w:t xml:space="preserve">Recommandations</w:t>
       </w:r>
     </w:p>
-    <w:bookmarkStart w:id="784" w:name="X5973edece93f8fc890bc50c38f65e5dee66731f"/>
+    <w:bookmarkStart w:id="794" w:name="X5973edece93f8fc890bc50c38f65e5dee66731f"/>
     <w:p>
       <w:pPr>
         <w:pStyle w:val="Heading4"/>
@@ -35907,8 +36207,8 @@
         <w:t xml:space="preserve">Engagement d’essai formulé par AM à la deuxième séance, puis auto-évaluation guidée de son effet à 30 jours et à 90 jours (source : compte rendu remis à la personne seule). Cible : engagement formulé avant la fin du premier mois et auto-évaluation faite à 90 jours, avant l’échéance « Pilote sur un seul site : dans les 6 mois ».</w:t>
       </w:r>
     </w:p>
-    <w:bookmarkEnd w:id="784"/>
-    <w:bookmarkStart w:id="785" w:name="Xf81e536ea878b71f013e1742f3404204c93944b"/>
+    <w:bookmarkEnd w:id="794"/>
+    <w:bookmarkStart w:id="795" w:name="Xf81e536ea878b71f013e1742f3404204c93944b"/>
     <w:p>
       <w:pPr>
         <w:pStyle w:val="Heading4"/>
@@ -36029,8 +36329,8 @@
         <w:t xml:space="preserve">Nombre de décisions du binôme reprises après coup, relevé dans le journal de décisions du programme au départ puis à 60 jours. Cible : moins de décisions reprises à 60 jours qu’au départ.</w:t>
       </w:r>
     </w:p>
-    <w:bookmarkEnd w:id="785"/>
-    <w:bookmarkStart w:id="786" w:name="X0c3fbabacdc3c33e6689c304b8124c24069e8c8"/>
+    <w:bookmarkEnd w:id="795"/>
+    <w:bookmarkStart w:id="796" w:name="X0c3fbabacdc3c33e6689c304b8124c24069e8c8"/>
     <w:p>
       <w:pPr>
         <w:pStyle w:val="Heading4"/>
@@ -36151,8 +36451,8 @@
         <w:t xml:space="preserve">Nombre de règles de fonctionnement adoptées par l’équipe et appliquées, relevé à l’atelier puis à 60 jours (source : charte d’équipe). Cible : charte d’équipe écrite et validée par chaque membre avant l’échéance « Pilote sur un seul site : dans les 6 mois ».</w:t>
       </w:r>
     </w:p>
-    <w:bookmarkEnd w:id="786"/>
-    <w:bookmarkStart w:id="787" w:name="Xfb1606855bd41596c8e5eadfde5094002415b55"/>
+    <w:bookmarkEnd w:id="796"/>
+    <w:bookmarkStart w:id="797" w:name="Xfb1606855bd41596c8e5eadfde5094002415b55"/>
     <w:p>
       <w:pPr>
         <w:pStyle w:val="Heading4"/>
@@ -36273,8 +36573,8 @@
         <w:t xml:space="preserve">Charte signée dans les 30 jours suivant l’autorisation, puis nombre de séances tenues et objectifs atteints relevés par la personne accompagnée à 90 jours (source : carnet de mentorat privé). Cible : charte signée dans le mois suivant l’autorisation, puis une séance tenue chaque mois jusqu’à l’échéance « Pilote sur un seul site : dans les 6 mois ».</w:t>
       </w:r>
     </w:p>
-    <w:bookmarkEnd w:id="787"/>
-    <w:bookmarkStart w:id="788" w:name="Xf65425f29b1432f1e4dd368ea60dfa05677090b"/>
+    <w:bookmarkEnd w:id="797"/>
+    <w:bookmarkStart w:id="798" w:name="Xf65425f29b1432f1e4dd368ea60dfa05677090b"/>
     <w:p>
       <w:pPr>
         <w:pStyle w:val="Heading4"/>
@@ -36395,8 +36695,8 @@
         <w:t xml:space="preserve">Nombre de livraisons entre les deux personnes renvoyées pour reprise, relevé avant le mentorat et à 60 jours (source : suivi des livrables du programme). Cible : moins de livraisons renvoyées à 60 jours qu’au départ.</w:t>
       </w:r>
     </w:p>
-    <w:bookmarkEnd w:id="788"/>
-    <w:bookmarkStart w:id="789" w:name="X12b0051d2f461951fd4d31252d06357d8e7ef01"/>
+    <w:bookmarkEnd w:id="798"/>
+    <w:bookmarkStart w:id="799" w:name="X12b0051d2f461951fd4d31252d06357d8e7ef01"/>
     <w:p>
       <w:pPr>
         <w:pStyle w:val="Heading4"/>
@@ -36517,8 +36817,8 @@
         <w:t xml:space="preserve">Délai de décision entre la filiale et le siège, relevé avant la formation puis à 90 jours (source : journal des décisions du programme). Cible : délai inférieur à celui de départ à 90 jours, l’objectif du cas étant de le réduire de moitié en 18 mois.</w:t>
       </w:r>
     </w:p>
-    <w:bookmarkEnd w:id="789"/>
-    <w:bookmarkStart w:id="790" w:name="X6561be37ffddf18b7a139d93594b74f7097f6ab"/>
+    <w:bookmarkEnd w:id="799"/>
+    <w:bookmarkStart w:id="800" w:name="X6561be37ffddf18b7a139d93594b74f7097f6ab"/>
     <w:p>
       <w:pPr>
         <w:pStyle w:val="Heading4"/>
@@ -36656,8 +36956,8 @@
         <w:t xml:space="preserve">Réponses des membres à trois questions ouvertes sur ce qu’ils peuvent dire en réunion, relevées avant la formation et à 90 jours (source : questionnaire court anonyme de l’équipe). Cible : à 90 jours, plus de réponses qu’au départ indiquant que chacun peut s’exprimer en réunion sans crainte.</w:t>
       </w:r>
     </w:p>
-    <w:bookmarkEnd w:id="790"/>
-    <w:bookmarkStart w:id="791" w:name="Xa10baae47dd423191ab06adb7101bbfb66b1c84"/>
+    <w:bookmarkEnd w:id="800"/>
+    <w:bookmarkStart w:id="801" w:name="Xa10baae47dd423191ab06adb7101bbfb66b1c84"/>
     <w:p>
       <w:pPr>
         <w:pStyle w:val="Heading4"/>
@@ -36778,8 +37078,8 @@
         <w:t xml:space="preserve">Respect des jalons datés du calendrier de lancement, relevé à chaque jalon du programme (source : tableau de bord du programme). Cible : tous les jalons datés tenus jusqu’à l’échéance « Pilote sur un seul site : dans les 6 mois ».</w:t>
       </w:r>
     </w:p>
-    <w:bookmarkEnd w:id="791"/>
-    <w:bookmarkStart w:id="792" w:name="Xf804d02e9a9ba904e0815e1a78685865c922455"/>
+    <w:bookmarkEnd w:id="801"/>
+    <w:bookmarkStart w:id="802" w:name="Xf804d02e9a9ba904e0815e1a78685865c922455"/>
     <w:p>
       <w:pPr>
         <w:pStyle w:val="Heading4"/>
@@ -36900,8 +37200,8 @@
         <w:t xml:space="preserve">Nombre de cases de la matrice sans accord entre les personnes, relevé à la validation puis à 60 jours (source : matrice versionnée du programme). Cible : aucune case sans accord à 60 jours.</w:t>
       </w:r>
     </w:p>
-    <w:bookmarkEnd w:id="792"/>
-    <w:bookmarkStart w:id="793" w:name="X67ed782a599abace45654bd27249de61b241bfb"/>
+    <w:bookmarkEnd w:id="802"/>
+    <w:bookmarkStart w:id="803" w:name="X67ed782a599abace45654bd27249de61b241bfb"/>
     <w:p>
       <w:pPr>
         <w:pStyle w:val="Heading4"/>
@@ -37022,8 +37322,8 @@
         <w:t xml:space="preserve">Délai moyen de décision entre la filiale et le siège, relevé avant les règles puis à 90 jours (source : journal des décisions du programme). Cible : délai inférieur à celui de départ à 90 jours, moitié du délai de départ en 18 mois (objectif du cas).</w:t>
       </w:r>
     </w:p>
-    <w:bookmarkEnd w:id="793"/>
-    <w:bookmarkStart w:id="794" w:name="X644cbd05855885aebcde43c6bf07bfd7bbf5935"/>
+    <w:bookmarkEnd w:id="803"/>
+    <w:bookmarkStart w:id="804" w:name="X644cbd05855885aebcde43c6bf07bfd7bbf5935"/>
     <w:p>
       <w:pPr>
         <w:pStyle w:val="Heading4"/>
@@ -37161,8 +37461,8 @@
         <w:t xml:space="preserve">Taux de participation aux rituels d’équipe du projet, relevé chaque mois depuis le premier rituel (source : feuilles de présence des rituels). Cible : chaque membre présent à chaque rituel du premier mois.</w:t>
       </w:r>
     </w:p>
-    <w:bookmarkEnd w:id="794"/>
-    <w:bookmarkStart w:id="795" w:name="Xb63f06b9562f7c65f592a895e55c36501ebcbcb"/>
+    <w:bookmarkEnd w:id="804"/>
+    <w:bookmarkStart w:id="805" w:name="Xb63f06b9562f7c65f592a895e55c36501ebcbcb"/>
     <w:p>
       <w:pPr>
         <w:pStyle w:val="Heading4"/>
@@ -37283,8 +37583,8 @@
         <w:t xml:space="preserve">Représentants du personnel informés avant diffusion (oui ou non), puis nombre de retraits de consentement, relevés à 30 jours et à 90 jours (source : registre des consentements). Cible : représentants informés avant l’échéance « Dépôt du dossier CNDP : dans les 3 mois » et aucun retrait de consentement laissé sans réponse à 90 jours.</w:t>
       </w:r>
     </w:p>
-    <w:bookmarkEnd w:id="795"/>
-    <w:bookmarkStart w:id="796" w:name="Xd39d98d1f9ed56be465a1d427eca7c621260b5d"/>
+    <w:bookmarkEnd w:id="805"/>
+    <w:bookmarkStart w:id="806" w:name="Xd39d98d1f9ed56be465a1d427eca7c621260b5d"/>
     <w:p>
       <w:pPr>
         <w:pStyle w:val="Heading4"/>
@@ -37405,8 +37705,8 @@
         <w:t xml:space="preserve">Les trois indicateurs relevés à la référence de départ (avant le premier jour), à 60 jours et à 90 jours (source : journal des décisions, tableau de bord du lancement, feuilles de présence). Cible : trois indicateurs relevés aux trois dates, valeur de départ consignée avant le premier jour.</w:t>
       </w:r>
     </w:p>
-    <w:bookmarkEnd w:id="796"/>
-    <w:bookmarkStart w:id="797" w:name="Xe9e37e558f5083ec48b4482c1e84852c2ac027b"/>
+    <w:bookmarkEnd w:id="806"/>
+    <w:bookmarkStart w:id="807" w:name="Xe9e37e558f5083ec48b4482c1e84852c2ac027b"/>
     <w:p>
       <w:pPr>
         <w:pStyle w:val="Heading4"/>
@@ -37544,8 +37844,8 @@
         <w:t xml:space="preserve">Pour chaque formation, niveaux 1 et 2 relevés à la session (source : questionnaires de session et exercice avant et après). Cible : niveaux 1 et 2 relevés pour chaque formation à sa session ; niveaux 3 et 4 hors plan, à planifier au bilan.</w:t>
       </w:r>
     </w:p>
-    <w:bookmarkEnd w:id="797"/>
-    <w:bookmarkStart w:id="798" w:name="Xc0193651929f2e0869db584849858279db95fc4"/>
+    <w:bookmarkEnd w:id="807"/>
+    <w:bookmarkStart w:id="808" w:name="Xc0193651929f2e0869db584849858279db95fc4"/>
     <w:p>
       <w:pPr>
         <w:pStyle w:val="Heading4"/>
@@ -37666,12 +37966,12 @@
         <w:t xml:space="preserve">Nombre de retraits de consentement et réponses aux trois questions ouvertes, relevés avant le démarrage puis à 90 jours (source : registre des consentements et questionnaire court). Cible : trois questions posées au départ et à 90 jours, tout retrait de consentement traité avant le jalon suivant.</w:t>
       </w:r>
     </w:p>
-    <w:bookmarkEnd w:id="798"/>
-    <w:bookmarkEnd w:id="799"/>
-    <w:bookmarkEnd w:id="800"/>
-    <w:bookmarkEnd w:id="801"/>
-    <w:bookmarkStart w:id="803" w:name="references"/>
-    <w:bookmarkStart w:id="802" w:name="références"/>
+    <w:bookmarkEnd w:id="808"/>
+    <w:bookmarkEnd w:id="809"/>
+    <w:bookmarkEnd w:id="810"/>
+    <w:bookmarkEnd w:id="811"/>
+    <w:bookmarkStart w:id="813" w:name="references"/>
+    <w:bookmarkStart w:id="812" w:name="références"/>
     <w:p>
       <w:pPr>
         <w:pStyle w:val="Heading2"/>
@@ -38005,6 +38305,54 @@
           </w:p>
         </w:tc>
       </w:tr>
+      <w:tr>
+        <w:tc>
+          <w:tcPr/>
+          <w:p>
+            <w:pPr>
+              <w:pStyle w:val="Compact"/>
+            </w:pPr>
+            <w:r>
+              <w:t xml:space="preserve">Krackhardt et Hanson, 1993, Harvard Business Review (« Informal Networks: The Company Behind the Chart »)</w:t>
+            </w:r>
+          </w:p>
+        </w:tc>
+        <w:tc>
+          <w:tcPr/>
+          <w:p>
+            <w:pPr>
+              <w:pStyle w:val="Compact"/>
+            </w:pPr>
+            <w:r>
+              <w:t xml:space="preserve">Non</w:t>
+            </w:r>
+          </w:p>
+        </w:tc>
+      </w:tr>
+      <w:tr>
+        <w:tc>
+          <w:tcPr/>
+          <w:p>
+            <w:pPr>
+              <w:pStyle w:val="Compact"/>
+            </w:pPr>
+            <w:r>
+              <w:t xml:space="preserve">Cross et Parker, 2004, The Hidden Power of Social Networks, Harvard Business School Press</w:t>
+            </w:r>
+          </w:p>
+        </w:tc>
+        <w:tc>
+          <w:tcPr/>
+          <w:p>
+            <w:pPr>
+              <w:pStyle w:val="Compact"/>
+            </w:pPr>
+            <w:r>
+              <w:t xml:space="preserve">Non</w:t>
+            </w:r>
+          </w:p>
+        </w:tc>
+      </w:tr>
     </w:tbl>
     <w:p>
       <w:pPr>
@@ -38014,8 +38362,8 @@
         <w:t xml:space="preserve">« Non » : la référence est citée de mémoire et sa source n'a pas été contrôlée. À contrôler avant toute citation externe.</w:t>
       </w:r>
     </w:p>
-    <w:bookmarkEnd w:id="802"/>
-    <w:bookmarkEnd w:id="803"/>
+    <w:bookmarkEnd w:id="812"/>
+    <w:bookmarkEnd w:id="813"/>
     <w:p>
       <w:pPr>
         <w:pStyle w:val="BodyText"/>
@@ -38024,7 +38372,7 @@
         <w:t xml:space="preserve">Rapport produit par script à partir des faits du moteur ; aucun nombre n'est calculé par un modèle.</w:t>
       </w:r>
     </w:p>
-    <w:bookmarkEnd w:id="804"/>
+    <w:bookmarkEnd w:id="814"/>
     <w:sectPr>
       <w:footnotePr>
         <w:numRestart w:val="eachSect"/>

</xml_diff>

<commit_message>
Rapport cabinet : un lien déclaré d'un seul côté n'est plus nommé, seulement compté
Décision d'Amine du 24/10 : seuls les liens réciproques sont nominatifs, la carte ne trace plus que ceux-là. Tests écrits avant, mutation rouge vue, audit à 0, sorties régénérées.

Claude-Session: https://claude.ai/code/session_0173ZZiGgKQsBo3M4cbm5VpC
</commit_message>
<xml_diff>
--- a/docs/design/rapport-cabinet/sortie/rapport-cabinet.docx
+++ b/docs/design/rapport-cabinet/sortie/rapport-cabinet.docx
@@ -31651,7 +31651,7 @@
         <w:pStyle w:val="BodyText"/>
       </w:pPr>
       <w:r>
-        <w:t xml:space="preserve">Conseil, à qui chacun demande conseil pour résoudre un problème de travail (au moins chaque mois) : 3 paires reliées sur 6 possibles. Liens réciproques : AM et KB ; SR et HT. Lien déclaré d’un seul côté : KB demande conseil à HT (déclaré par KB seulement).</w:t>
+        <w:t xml:space="preserve">Conseil, à qui chacun demande conseil pour résoudre un problème de travail (au moins chaque mois) : 3 paires reliées sur 6 possibles. Liens réciproques : AM et KB ; SR et HT. 1 lien déclaré d’un seul côté.</w:t>
       </w:r>
     </w:p>
     <w:bookmarkEnd w:id="675"/>
@@ -31669,7 +31669,7 @@
         <w:pStyle w:val="BodyText"/>
       </w:pPr>
       <w:r>
-        <w:t xml:space="preserve">Information, de qui chacun reçoit une information utile à son travail (au moins chaque mois) : 5 paires reliées sur 6 possibles. Liens réciproques : AM et KB ; KB et SR ; KB et HT ; SR et HT. Lien déclaré d’un seul côté : AM reçoit une information utile de SR (déclaré par AM seulement).</w:t>
+        <w:t xml:space="preserve">Information, de qui chacun reçoit une information utile à son travail (au moins chaque mois) : 5 paires reliées sur 6 possibles. Liens réciproques : AM et KB ; KB et SR ; KB et HT ; SR et HT. 1 lien déclaré d’un seul côté.</w:t>
       </w:r>
     </w:p>
     <w:bookmarkEnd w:id="676"/>

</xml_diff>